<commit_message>
docs: generate comprehensive technical defense Word report and update handover doc
</commit_message>
<xml_diff>
--- a/x402付费天气API服务搭建与全链路验证报告.docx
+++ b/x402付费天气API服务搭建与全链路验证报告.docx
@@ -14,24 +14,23 @@
           <w:color w:val="1F497D"/>
           <w:sz w:val="44"/>
         </w:rPr>
-        <w:t>基于 x402 协议搭建付费天气 API 服务</w:t>
+        <w:t>x402 付费天气 API 服务</w:t>
         <w:br/>
-        <w:t>及 AI Agent 自主付款实操报告</w:t>
+        <w:t>全景代码架构与项目技术答辩报告</w:t>
       </w:r>
     </w:p>
     <w:p>
       <w:pPr>
-        <w:spacing w:after="400"/>
+        <w:spacing w:after="480"/>
         <w:jc w:val="center"/>
       </w:pPr>
       <w:r>
         <w:rPr>
           <w:rFonts w:ascii="微软雅黑" w:hAnsi="微软雅黑"/>
-          <w:i/>
           <w:color w:val="595959"/>
-          <w:sz w:val="26"/>
+          <w:sz w:val="24"/>
         </w:rPr>
-        <w:t>—— Base Sepolia 测试网端到端全链路闭环验证与 Vercel 生产部署</w:t>
+        <w:t>—— 基于 Base Sepolia 与 EIP-3009 的 AI Agent 原生微支付全链路工程实践</w:t>
       </w:r>
     </w:p>
     <w:tbl>
@@ -41,8 +40,8 @@
         <w:tblLook w:firstColumn="1" w:firstRow="1" w:lastColumn="0" w:lastRow="0" w:noHBand="0" w:noVBand="1" w:val="04A0"/>
       </w:tblPr>
       <w:tblGrid>
-        <w:gridCol w:w="4680"/>
-        <w:gridCol w:w="4680"/>
+        <w:gridCol w:w="4536"/>
+        <w:gridCol w:w="4536"/>
       </w:tblGrid>
       <w:tr>
         <w:trPr>
@@ -50,23 +49,21 @@
         </w:trPr>
         <w:tc>
           <w:tcPr>
-            <w:tcW w:type="dxa" w:w="2592"/>
+            <w:tcW w:type="dxa" w:w="4536"/>
             <w:vAlign w:val="center"/>
             <w:tcMar>
-              <w:top w:w="120" w:type="dxa"/>
-              <w:bottom w:w="120" w:type="dxa"/>
-              <w:left w:w="180" w:type="dxa"/>
-              <w:right w:w="180" w:type="dxa"/>
+              <w:top w:w="100" w:type="dxa"/>
+              <w:bottom w:w="100" w:type="dxa"/>
+              <w:left w:w="140" w:type="dxa"/>
+              <w:right w:w="140" w:type="dxa"/>
             </w:tcMar>
             <w:shd w:fill="2E5B88"/>
           </w:tcPr>
           <w:p>
             <w:r>
               <w:rPr>
-                <w:rFonts w:ascii="微软雅黑" w:hAnsi="微软雅黑"/>
                 <w:b/>
                 <w:color w:val="FFFFFF"/>
-                <w:sz w:val="20"/>
               </w:rPr>
               <w:t>项目定位</w:t>
             </w:r>
@@ -74,25 +71,23 @@
         </w:tc>
         <w:tc>
           <w:tcPr>
-            <w:tcW w:type="dxa" w:w="6480"/>
+            <w:tcW w:type="dxa" w:w="4536"/>
             <w:vAlign w:val="center"/>
             <w:tcMar>
-              <w:top w:w="120" w:type="dxa"/>
-              <w:bottom w:w="120" w:type="dxa"/>
-              <w:left w:w="180" w:type="dxa"/>
-              <w:right w:w="180" w:type="dxa"/>
+              <w:top w:w="100" w:type="dxa"/>
+              <w:bottom w:w="100" w:type="dxa"/>
+              <w:left w:w="140" w:type="dxa"/>
+              <w:right w:w="140" w:type="dxa"/>
             </w:tcMar>
             <w:shd w:fill="2E5B88"/>
           </w:tcPr>
           <w:p>
             <w:r>
               <w:rPr>
-                <w:rFonts w:ascii="微软雅黑" w:hAnsi="微软雅黑"/>
                 <w:b/>
                 <w:color w:val="FFFFFF"/>
-                <w:sz w:val="20"/>
               </w:rPr>
-              <w:t>AI Agent 自主为 Web API 服务付费商业模式验证</w:t>
+              <w:t>验证「AI Agent 自主发现、谈判并为 Web API 签名付费」的闭环交互</w:t>
             </w:r>
           </w:p>
         </w:tc>
@@ -103,46 +98,40 @@
         </w:trPr>
         <w:tc>
           <w:tcPr>
-            <w:tcW w:type="dxa" w:w="2592"/>
+            <w:tcW w:type="dxa" w:w="4536"/>
             <w:vAlign w:val="center"/>
             <w:tcMar>
-              <w:top w:w="120" w:type="dxa"/>
-              <w:bottom w:w="120" w:type="dxa"/>
-              <w:left w:w="180" w:type="dxa"/>
-              <w:right w:w="180" w:type="dxa"/>
+              <w:top w:w="100" w:type="dxa"/>
+              <w:bottom w:w="100" w:type="dxa"/>
+              <w:left w:w="140" w:type="dxa"/>
+              <w:right w:w="140" w:type="dxa"/>
             </w:tcMar>
-            <w:shd w:fill="F2F5F9"/>
+            <w:shd w:fill="F4F7FA"/>
           </w:tcPr>
           <w:p>
             <w:r>
               <w:rPr>
-                <w:rFonts w:ascii="微软雅黑" w:hAnsi="微软雅黑"/>
                 <w:b/>
-                <w:sz w:val="20"/>
               </w:rPr>
-              <w:t>执行智能体</w:t>
+              <w:t>核心技术栈</w:t>
             </w:r>
           </w:p>
         </w:tc>
         <w:tc>
           <w:tcPr>
-            <w:tcW w:type="dxa" w:w="6480"/>
+            <w:tcW w:type="dxa" w:w="4536"/>
             <w:vAlign w:val="center"/>
             <w:tcMar>
-              <w:top w:w="120" w:type="dxa"/>
-              <w:bottom w:w="120" w:type="dxa"/>
-              <w:left w:w="180" w:type="dxa"/>
-              <w:right w:w="180" w:type="dxa"/>
+              <w:top w:w="100" w:type="dxa"/>
+              <w:bottom w:w="100" w:type="dxa"/>
+              <w:left w:w="140" w:type="dxa"/>
+              <w:right w:w="140" w:type="dxa"/>
             </w:tcMar>
-            <w:shd w:fill="F2F5F9"/>
+            <w:shd w:fill="F4F7FA"/>
           </w:tcPr>
           <w:p>
             <w:r>
-              <w:rPr>
-                <w:rFonts w:ascii="微软雅黑" w:hAnsi="微软雅黑"/>
-                <w:sz w:val="20"/>
-              </w:rPr>
-              <w:t>Antigravity Agent (DeepMind AI Coding Assistant)</w:t>
+              <w:t>Node.js (ESM), Express, @x402/* v2, Viem, Vercel Serverless, Base Sepolia</w:t>
             </w:r>
           </w:p>
         </w:tc>
@@ -153,46 +142,40 @@
         </w:trPr>
         <w:tc>
           <w:tcPr>
-            <w:tcW w:type="dxa" w:w="2592"/>
+            <w:tcW w:type="dxa" w:w="4536"/>
             <w:vAlign w:val="center"/>
             <w:tcMar>
-              <w:top w:w="120" w:type="dxa"/>
-              <w:bottom w:w="120" w:type="dxa"/>
-              <w:left w:w="180" w:type="dxa"/>
-              <w:right w:w="180" w:type="dxa"/>
+              <w:top w:w="100" w:type="dxa"/>
+              <w:bottom w:w="100" w:type="dxa"/>
+              <w:left w:w="140" w:type="dxa"/>
+              <w:right w:w="140" w:type="dxa"/>
             </w:tcMar>
             <w:shd w:fill="FFFFFF"/>
           </w:tcPr>
           <w:p>
             <w:r>
               <w:rPr>
-                <w:rFonts w:ascii="微软雅黑" w:hAnsi="微软雅黑"/>
                 <w:b/>
-                <w:sz w:val="20"/>
               </w:rPr>
-              <w:t>测试网络</w:t>
+              <w:t>开源代码仓库</w:t>
             </w:r>
           </w:p>
         </w:tc>
         <w:tc>
           <w:tcPr>
-            <w:tcW w:type="dxa" w:w="6480"/>
+            <w:tcW w:type="dxa" w:w="4536"/>
             <w:vAlign w:val="center"/>
             <w:tcMar>
-              <w:top w:w="120" w:type="dxa"/>
-              <w:bottom w:w="120" w:type="dxa"/>
-              <w:left w:w="180" w:type="dxa"/>
-              <w:right w:w="180" w:type="dxa"/>
+              <w:top w:w="100" w:type="dxa"/>
+              <w:bottom w:w="100" w:type="dxa"/>
+              <w:left w:w="140" w:type="dxa"/>
+              <w:right w:w="140" w:type="dxa"/>
             </w:tcMar>
             <w:shd w:fill="FFFFFF"/>
           </w:tcPr>
           <w:p>
             <w:r>
-              <w:rPr>
-                <w:rFonts w:ascii="微软雅黑" w:hAnsi="微软雅黑"/>
-                <w:sz w:val="20"/>
-              </w:rPr>
-              <w:t>Base Sepolia 测试网 (CAIP-2: eip155:84532)</w:t>
+              <w:t>https://github.com/zou999999999/x402-weather-service-L1-26.10.22</w:t>
             </w:r>
           </w:p>
         </w:tc>
@@ -203,46 +186,40 @@
         </w:trPr>
         <w:tc>
           <w:tcPr>
-            <w:tcW w:type="dxa" w:w="2592"/>
+            <w:tcW w:type="dxa" w:w="4536"/>
             <w:vAlign w:val="center"/>
             <w:tcMar>
-              <w:top w:w="120" w:type="dxa"/>
-              <w:bottom w:w="120" w:type="dxa"/>
-              <w:left w:w="180" w:type="dxa"/>
-              <w:right w:w="180" w:type="dxa"/>
+              <w:top w:w="100" w:type="dxa"/>
+              <w:bottom w:w="100" w:type="dxa"/>
+              <w:left w:w="140" w:type="dxa"/>
+              <w:right w:w="140" w:type="dxa"/>
             </w:tcMar>
-            <w:shd w:fill="F2F5F9"/>
+            <w:shd w:fill="F4F7FA"/>
           </w:tcPr>
           <w:p>
             <w:r>
               <w:rPr>
-                <w:rFonts w:ascii="微软雅黑" w:hAnsi="微软雅黑"/>
                 <w:b/>
-                <w:sz w:val="20"/>
               </w:rPr>
-              <w:t>完成时间</w:t>
+              <w:t>云端生产环境</w:t>
             </w:r>
           </w:p>
         </w:tc>
         <w:tc>
           <w:tcPr>
-            <w:tcW w:type="dxa" w:w="6480"/>
+            <w:tcW w:type="dxa" w:w="4536"/>
             <w:vAlign w:val="center"/>
             <w:tcMar>
-              <w:top w:w="120" w:type="dxa"/>
-              <w:bottom w:w="120" w:type="dxa"/>
-              <w:left w:w="180" w:type="dxa"/>
-              <w:right w:w="180" w:type="dxa"/>
+              <w:top w:w="100" w:type="dxa"/>
+              <w:bottom w:w="100" w:type="dxa"/>
+              <w:left w:w="140" w:type="dxa"/>
+              <w:right w:w="140" w:type="dxa"/>
             </w:tcMar>
-            <w:shd w:fill="F2F5F9"/>
+            <w:shd w:fill="F4F7FA"/>
           </w:tcPr>
           <w:p>
             <w:r>
-              <w:rPr>
-                <w:rFonts w:ascii="微软雅黑" w:hAnsi="微软雅黑"/>
-                <w:sz w:val="20"/>
-              </w:rPr>
-              <w:t>2026 年 10 月 20 日</w:t>
+              <w:t>https://x402-weather-service.vercel.app (全时段 24/7 在线)</w:t>
             </w:r>
           </w:p>
         </w:tc>
@@ -252,26 +229,15 @@
     <w:p>
       <w:pPr>
         <w:pStyle w:val="Heading1"/>
-        <w:spacing w:before="280" w:after="120"/>
+        <w:spacing w:before="320" w:after="120"/>
       </w:pPr>
       <w:r>
-        <w:t>一、 任务概述与系统架构</w:t>
-      </w:r>
-    </w:p>
-    <w:p>
-      <w:pPr>
-        <w:spacing w:line="300" w:lineRule="auto"/>
-      </w:pPr>
-      <w:r>
-        <w:t>本项目的核心目标是验证「AI Agent 自主发现、谈判并为 API 服务付费」的前沿交互范式。整个系统基于 HTTP 402 Payment Required 状态码和最新的 x402 协议（v2 系列），构建了一个集成了收费中间件的天气云端服务，并编写客户端驱动 Agent 自动完成未付款探测、账单安全核验、EIP-3009 授权转账、实况天气获取以及链上不可篡改的对账审计。</w:t>
+        <w:t>一、 项目核心网络资产与配置清单</w:t>
       </w:r>
     </w:p>
     <w:p>
       <w:r>
-        <w:rPr>
-          <w:b/>
-        </w:rPr>
-        <w:t>业务流转时序（Sequence Flow）：</w:t>
+        <w:t>本项目依托 Coinbase 孵化的以太坊 Layer2 扩容网络 Base Sepolia 测试网，完全遵循 HTTP 402 Payment Required 原生标准，打通了服务发布、Agent 拦截探测、EIP-3009 本地内存加密授权以及链上代付结算的全流程。</w:t>
       </w:r>
     </w:p>
     <w:tbl>
@@ -281,18 +247,470 @@
         <w:tblLook w:firstColumn="1" w:firstRow="1" w:lastColumn="0" w:lastRow="0" w:noHBand="0" w:noVBand="1" w:val="04A0"/>
       </w:tblPr>
       <w:tblGrid>
-        <w:gridCol w:w="9360"/>
+        <w:gridCol w:w="3024"/>
+        <w:gridCol w:w="3024"/>
+        <w:gridCol w:w="3024"/>
+      </w:tblGrid>
+      <w:tr>
+        <w:trPr>
+          <w:cantSplit/>
+        </w:trPr>
+        <w:tc>
+          <w:tcPr>
+            <w:tcW w:type="dxa" w:w="3024"/>
+            <w:vAlign w:val="center"/>
+            <w:tcMar>
+              <w:top w:w="100" w:type="dxa"/>
+              <w:bottom w:w="100" w:type="dxa"/>
+              <w:left w:w="140" w:type="dxa"/>
+              <w:right w:w="140" w:type="dxa"/>
+            </w:tcMar>
+            <w:shd w:fill="1F497D"/>
+          </w:tcPr>
+          <w:p>
+            <w:r>
+              <w:rPr>
+                <w:b/>
+                <w:color w:val="FFFFFF"/>
+              </w:rPr>
+              <w:t>资产类别</w:t>
+            </w:r>
+          </w:p>
+        </w:tc>
+        <w:tc>
+          <w:tcPr>
+            <w:tcW w:type="dxa" w:w="3024"/>
+            <w:vAlign w:val="center"/>
+            <w:tcMar>
+              <w:top w:w="100" w:type="dxa"/>
+              <w:bottom w:w="100" w:type="dxa"/>
+              <w:left w:w="140" w:type="dxa"/>
+              <w:right w:w="140" w:type="dxa"/>
+            </w:tcMar>
+            <w:shd w:fill="1F497D"/>
+          </w:tcPr>
+          <w:p>
+            <w:r>
+              <w:rPr>
+                <w:b/>
+                <w:color w:val="FFFFFF"/>
+              </w:rPr>
+              <w:t>配置属性 / 网络端点</w:t>
+            </w:r>
+          </w:p>
+        </w:tc>
+        <w:tc>
+          <w:tcPr>
+            <w:tcW w:type="dxa" w:w="3024"/>
+            <w:vAlign w:val="center"/>
+            <w:tcMar>
+              <w:top w:w="100" w:type="dxa"/>
+              <w:bottom w:w="100" w:type="dxa"/>
+              <w:left w:w="140" w:type="dxa"/>
+              <w:right w:w="140" w:type="dxa"/>
+            </w:tcMar>
+            <w:shd w:fill="1F497D"/>
+          </w:tcPr>
+          <w:p>
+            <w:r>
+              <w:rPr>
+                <w:b/>
+                <w:color w:val="FFFFFF"/>
+              </w:rPr>
+              <w:t>参数详情与作用</w:t>
+            </w:r>
+          </w:p>
+        </w:tc>
+      </w:tr>
+      <w:tr>
+        <w:trPr>
+          <w:cantSplit/>
+        </w:trPr>
+        <w:tc>
+          <w:tcPr>
+            <w:tcW w:type="dxa" w:w="3024"/>
+            <w:vAlign w:val="center"/>
+            <w:tcMar>
+              <w:top w:w="100" w:type="dxa"/>
+              <w:bottom w:w="100" w:type="dxa"/>
+              <w:left w:w="140" w:type="dxa"/>
+              <w:right w:w="140" w:type="dxa"/>
+            </w:tcMar>
+            <w:shd w:fill="F2F5F9"/>
+          </w:tcPr>
+          <w:p>
+            <w:r>
+              <w:t>底层区块链</w:t>
+            </w:r>
+          </w:p>
+        </w:tc>
+        <w:tc>
+          <w:tcPr>
+            <w:tcW w:type="dxa" w:w="3024"/>
+            <w:vAlign w:val="center"/>
+            <w:tcMar>
+              <w:top w:w="100" w:type="dxa"/>
+              <w:bottom w:w="100" w:type="dxa"/>
+              <w:left w:w="140" w:type="dxa"/>
+              <w:right w:w="140" w:type="dxa"/>
+            </w:tcMar>
+            <w:shd w:fill="F2F5F9"/>
+          </w:tcPr>
+          <w:p>
+            <w:r>
+              <w:t>结算网络 (CAIP-2)</w:t>
+            </w:r>
+          </w:p>
+        </w:tc>
+        <w:tc>
+          <w:tcPr>
+            <w:tcW w:type="dxa" w:w="3024"/>
+            <w:vAlign w:val="center"/>
+            <w:tcMar>
+              <w:top w:w="100" w:type="dxa"/>
+              <w:bottom w:w="100" w:type="dxa"/>
+              <w:left w:w="140" w:type="dxa"/>
+              <w:right w:w="140" w:type="dxa"/>
+            </w:tcMar>
+            <w:shd w:fill="F2F5F9"/>
+          </w:tcPr>
+          <w:p>
+            <w:r>
+              <w:t>Base Sepolia 测试网 (eip155:84532, Chain ID: 84532)</w:t>
+            </w:r>
+          </w:p>
+        </w:tc>
+      </w:tr>
+      <w:tr>
+        <w:trPr>
+          <w:cantSplit/>
+        </w:trPr>
+        <w:tc>
+          <w:tcPr>
+            <w:tcW w:type="dxa" w:w="3024"/>
+            <w:vAlign w:val="center"/>
+            <w:tcMar>
+              <w:top w:w="100" w:type="dxa"/>
+              <w:bottom w:w="100" w:type="dxa"/>
+              <w:left w:w="140" w:type="dxa"/>
+              <w:right w:w="140" w:type="dxa"/>
+            </w:tcMar>
+            <w:shd w:fill="FFFFFF"/>
+          </w:tcPr>
+          <w:p>
+            <w:r>
+              <w:t>结算代币</w:t>
+            </w:r>
+          </w:p>
+        </w:tc>
+        <w:tc>
+          <w:tcPr>
+            <w:tcW w:type="dxa" w:w="3024"/>
+            <w:vAlign w:val="center"/>
+            <w:tcMar>
+              <w:top w:w="100" w:type="dxa"/>
+              <w:bottom w:w="100" w:type="dxa"/>
+              <w:left w:w="140" w:type="dxa"/>
+              <w:right w:w="140" w:type="dxa"/>
+            </w:tcMar>
+            <w:shd w:fill="FFFFFF"/>
+          </w:tcPr>
+          <w:p>
+            <w:r>
+              <w:t>Circle 官方测试 USDC</w:t>
+            </w:r>
+          </w:p>
+        </w:tc>
+        <w:tc>
+          <w:tcPr>
+            <w:tcW w:type="dxa" w:w="3024"/>
+            <w:vAlign w:val="center"/>
+            <w:tcMar>
+              <w:top w:w="100" w:type="dxa"/>
+              <w:bottom w:w="100" w:type="dxa"/>
+              <w:left w:w="140" w:type="dxa"/>
+              <w:right w:w="140" w:type="dxa"/>
+            </w:tcMar>
+            <w:shd w:fill="FFFFFF"/>
+          </w:tcPr>
+          <w:p>
+            <w:r>
+              <w:t>0x036CbD53842c5426634e7929541eC2318f3dCF7e (精度: 6位小数)</w:t>
+            </w:r>
+          </w:p>
+        </w:tc>
+      </w:tr>
+      <w:tr>
+        <w:trPr>
+          <w:cantSplit/>
+        </w:trPr>
+        <w:tc>
+          <w:tcPr>
+            <w:tcW w:type="dxa" w:w="3024"/>
+            <w:vAlign w:val="center"/>
+            <w:tcMar>
+              <w:top w:w="100" w:type="dxa"/>
+              <w:bottom w:w="100" w:type="dxa"/>
+              <w:left w:w="140" w:type="dxa"/>
+              <w:right w:w="140" w:type="dxa"/>
+            </w:tcMar>
+            <w:shd w:fill="F2F5F9"/>
+          </w:tcPr>
+          <w:p>
+            <w:r>
+              <w:t>单次调用定价</w:t>
+            </w:r>
+          </w:p>
+        </w:tc>
+        <w:tc>
+          <w:tcPr>
+            <w:tcW w:type="dxa" w:w="3024"/>
+            <w:vAlign w:val="center"/>
+            <w:tcMar>
+              <w:top w:w="100" w:type="dxa"/>
+              <w:bottom w:w="100" w:type="dxa"/>
+              <w:left w:w="140" w:type="dxa"/>
+              <w:right w:w="140" w:type="dxa"/>
+            </w:tcMar>
+            <w:shd w:fill="F2F5F9"/>
+          </w:tcPr>
+          <w:p>
+            <w:r>
+              <w:t>API 调用成本</w:t>
+            </w:r>
+          </w:p>
+        </w:tc>
+        <w:tc>
+          <w:tcPr>
+            <w:tcW w:type="dxa" w:w="3024"/>
+            <w:vAlign w:val="center"/>
+            <w:tcMar>
+              <w:top w:w="100" w:type="dxa"/>
+              <w:bottom w:w="100" w:type="dxa"/>
+              <w:left w:w="140" w:type="dxa"/>
+              <w:right w:w="140" w:type="dxa"/>
+            </w:tcMar>
+            <w:shd w:fill="F2F5F9"/>
+          </w:tcPr>
+          <w:p>
+            <w:r>
+              <w:t>$0.001 USDC / 次 (即 1000 atomic units，千分之一美元)</w:t>
+            </w:r>
+          </w:p>
+        </w:tc>
+      </w:tr>
+      <w:tr>
+        <w:trPr>
+          <w:cantSplit/>
+        </w:trPr>
+        <w:tc>
+          <w:tcPr>
+            <w:tcW w:type="dxa" w:w="3024"/>
+            <w:vAlign w:val="center"/>
+            <w:tcMar>
+              <w:top w:w="100" w:type="dxa"/>
+              <w:bottom w:w="100" w:type="dxa"/>
+              <w:left w:w="140" w:type="dxa"/>
+              <w:right w:w="140" w:type="dxa"/>
+            </w:tcMar>
+            <w:shd w:fill="FFFFFF"/>
+          </w:tcPr>
+          <w:p>
+            <w:r>
+              <w:t>收款方钱包</w:t>
+            </w:r>
+          </w:p>
+        </w:tc>
+        <w:tc>
+          <w:tcPr>
+            <w:tcW w:type="dxa" w:w="3024"/>
+            <w:vAlign w:val="center"/>
+            <w:tcMar>
+              <w:top w:w="100" w:type="dxa"/>
+              <w:bottom w:w="100" w:type="dxa"/>
+              <w:left w:w="140" w:type="dxa"/>
+              <w:right w:w="140" w:type="dxa"/>
+            </w:tcMar>
+            <w:shd w:fill="FFFFFF"/>
+          </w:tcPr>
+          <w:p>
+            <w:r>
+              <w:t>服务端收益接收 (PayTo)</w:t>
+            </w:r>
+          </w:p>
+        </w:tc>
+        <w:tc>
+          <w:tcPr>
+            <w:tcW w:type="dxa" w:w="3024"/>
+            <w:vAlign w:val="center"/>
+            <w:tcMar>
+              <w:top w:w="100" w:type="dxa"/>
+              <w:bottom w:w="100" w:type="dxa"/>
+              <w:left w:w="140" w:type="dxa"/>
+              <w:right w:w="140" w:type="dxa"/>
+            </w:tcMar>
+            <w:shd w:fill="FFFFFF"/>
+          </w:tcPr>
+          <w:p>
+            <w:r>
+              <w:t>0xdcD7DAFafb0EF3d50bDdB480Dbd503Fa6D1B6C09 (仅需公开地址)</w:t>
+            </w:r>
+          </w:p>
+        </w:tc>
+      </w:tr>
+      <w:tr>
+        <w:trPr>
+          <w:cantSplit/>
+        </w:trPr>
+        <w:tc>
+          <w:tcPr>
+            <w:tcW w:type="dxa" w:w="3024"/>
+            <w:vAlign w:val="center"/>
+            <w:tcMar>
+              <w:top w:w="100" w:type="dxa"/>
+              <w:bottom w:w="100" w:type="dxa"/>
+              <w:left w:w="140" w:type="dxa"/>
+              <w:right w:w="140" w:type="dxa"/>
+            </w:tcMar>
+            <w:shd w:fill="F2F5F9"/>
+          </w:tcPr>
+          <w:p>
+            <w:r>
+              <w:t>付款方钱包</w:t>
+            </w:r>
+          </w:p>
+        </w:tc>
+        <w:tc>
+          <w:tcPr>
+            <w:tcW w:type="dxa" w:w="3024"/>
+            <w:vAlign w:val="center"/>
+            <w:tcMar>
+              <w:top w:w="100" w:type="dxa"/>
+              <w:bottom w:w="100" w:type="dxa"/>
+              <w:left w:w="140" w:type="dxa"/>
+              <w:right w:w="140" w:type="dxa"/>
+            </w:tcMar>
+            <w:shd w:fill="F2F5F9"/>
+          </w:tcPr>
+          <w:p>
+            <w:r>
+              <w:t>Agent 扣费钱包 (Payer)</w:t>
+            </w:r>
+          </w:p>
+        </w:tc>
+        <w:tc>
+          <w:tcPr>
+            <w:tcW w:type="dxa" w:w="3024"/>
+            <w:vAlign w:val="center"/>
+            <w:tcMar>
+              <w:top w:w="100" w:type="dxa"/>
+              <w:bottom w:w="100" w:type="dxa"/>
+              <w:left w:w="140" w:type="dxa"/>
+              <w:right w:w="140" w:type="dxa"/>
+            </w:tcMar>
+            <w:shd w:fill="F2F5F9"/>
+          </w:tcPr>
+          <w:p>
+            <w:r>
+              <w:t>0x4830D4857AdA8b000aFC1C2702294B0999dEaFB3 (本地私钥签名)</w:t>
+            </w:r>
+          </w:p>
+        </w:tc>
+      </w:tr>
+      <w:tr>
+        <w:trPr>
+          <w:cantSplit/>
+        </w:trPr>
+        <w:tc>
+          <w:tcPr>
+            <w:tcW w:type="dxa" w:w="3024"/>
+            <w:vAlign w:val="center"/>
+            <w:tcMar>
+              <w:top w:w="100" w:type="dxa"/>
+              <w:bottom w:w="100" w:type="dxa"/>
+              <w:left w:w="140" w:type="dxa"/>
+              <w:right w:w="140" w:type="dxa"/>
+            </w:tcMar>
+            <w:shd w:fill="FFFFFF"/>
+          </w:tcPr>
+          <w:p>
+            <w:r>
+              <w:t>清算基础设施</w:t>
+            </w:r>
+          </w:p>
+        </w:tc>
+        <w:tc>
+          <w:tcPr>
+            <w:tcW w:type="dxa" w:w="3024"/>
+            <w:vAlign w:val="center"/>
+            <w:tcMar>
+              <w:top w:w="100" w:type="dxa"/>
+              <w:bottom w:w="100" w:type="dxa"/>
+              <w:left w:w="140" w:type="dxa"/>
+              <w:right w:w="140" w:type="dxa"/>
+            </w:tcMar>
+            <w:shd w:fill="FFFFFF"/>
+          </w:tcPr>
+          <w:p>
+            <w:r>
+              <w:t>公共 Facilitator 网关</w:t>
+            </w:r>
+          </w:p>
+        </w:tc>
+        <w:tc>
+          <w:tcPr>
+            <w:tcW w:type="dxa" w:w="3024"/>
+            <w:vAlign w:val="center"/>
+            <w:tcMar>
+              <w:top w:w="100" w:type="dxa"/>
+              <w:bottom w:w="100" w:type="dxa"/>
+              <w:left w:w="140" w:type="dxa"/>
+              <w:right w:w="140" w:type="dxa"/>
+            </w:tcMar>
+            <w:shd w:fill="FFFFFF"/>
+          </w:tcPr>
+          <w:p>
+            <w:r>
+              <w:t>https://x402.org/facilitator (验证 EIP-3009 签名，免 Gas 代付)</w:t>
+            </w:r>
+          </w:p>
+        </w:tc>
+      </w:tr>
+    </w:tbl>
+    <w:p/>
+    <w:p>
+      <w:pPr>
+        <w:pStyle w:val="Heading1"/>
+        <w:spacing w:before="320" w:after="120"/>
+      </w:pPr>
+      <w:r>
+        <w:t>二、 全景代码架构与逐层目录深度剖析</w:t>
+      </w:r>
+    </w:p>
+    <w:p>
+      <w:r>
+        <w:t>本项目工程结构严格践行「高内聚、低耦合」、「关注点分离」与「防御性编程」原则。源码树完整结构如下：</w:t>
+      </w:r>
+    </w:p>
+    <w:tbl>
+      <w:tblPr>
+        <w:tblW w:type="auto" w:w="0"/>
+        <w:jc w:val="center"/>
+        <w:tblLook w:firstColumn="1" w:firstRow="1" w:lastColumn="0" w:lastRow="0" w:noHBand="0" w:noVBand="1" w:val="04A0"/>
+      </w:tblPr>
+      <w:tblGrid>
+        <w:gridCol w:w="9072"/>
       </w:tblGrid>
       <w:tr>
         <w:tc>
           <w:tcPr>
-            <w:tcW w:type="dxa" w:w="9360"/>
+            <w:tcW w:type="dxa" w:w="9072"/>
             <w:shd w:fill="F8F9FA"/>
             <w:tcMar>
-              <w:top w:w="120" w:type="dxa"/>
-              <w:bottom w:w="120" w:type="dxa"/>
-              <w:left w:w="200" w:type="dxa"/>
-              <w:right w:w="200" w:type="dxa"/>
+              <w:top w:w="100" w:type="dxa"/>
+              <w:bottom w:w="100" w:type="dxa"/>
+              <w:left w:w="160" w:type="dxa"/>
+              <w:right w:w="160" w:type="dxa"/>
             </w:tcMar>
           </w:tcPr>
           <w:p>
@@ -303,45 +721,51 @@
               <w:rPr>
                 <w:rFonts w:ascii="Consolas" w:hAnsi="Consolas"/>
                 <w:color w:val="282C34"/>
-                <w:sz w:val="19"/>
+                <w:sz w:val="18"/>
               </w:rPr>
-              <w:t>用户对 Agent 提问: "查一下北京的天气"</w:t>
+              <w:t>x402-weather-service/</w:t>
               <w:br/>
-              <w:t xml:space="preserve">  │</w:t>
+              <w:t>├── api/                     # 【云端 Serverless 接入层】</w:t>
               <w:br/>
-              <w:t xml:space="preserve">  ▼</w:t>
+              <w:t>│   └── index.js             # Express 核心 API 服务，集成 x402 中间件，兼容 Vercel 云函数</w:t>
               <w:br/>
-              <w:t>[Agent 客户端] 发起初始请求: GET /api/weather?city=北京 (未付款)</w:t>
+              <w:t>├── src/                     # 【核心业务与底层支撑层】</w:t>
               <w:br/>
-              <w:t xml:space="preserve">  │</w:t>
+              <w:t>│   ├── config/              #   ├── 配置子模块（环境嗅探与私密凭据读取）</w:t>
               <w:br/>
-              <w:t xml:space="preserve">  ▼</w:t>
+              <w:t>│   │   └── wallet.js        #   │   └── 钱包私钥与地址的安全解析层（防御性路径探测、0x自动补齐）</w:t>
               <w:br/>
-              <w:t>[Vercel / Express 服务端] x402 中间件拦截并返回: HTTP 402 + 结构化账单</w:t>
+              <w:t>│   └── providers/           #   └── 天气数据源抽象子模块（策略模式，与支付解耦）</w:t>
               <w:br/>
-              <w:t xml:space="preserve">  │</w:t>
+              <w:t>│       ├── openmeteo.js     #       ├── Open-Meteo 天气源（免 Key 免注册，地理编码 + 气象预报）</w:t>
               <w:br/>
-              <w:t xml:space="preserve">  ▼</w:t>
+              <w:t>│       ├── amap.js          #       ├── 高德天气源（国内高精度，城市名到 adcode 映射转换）</w:t>
               <w:br/>
-              <w:t>[Agent 客户端] 解析账单要素并执行【4大强制安全核验】，停顿确认后生成 EIP-3009 授权签名</w:t>
+              <w:t>│       └── index.js         #       └── 统一工厂调度层（支持环境变量热切换数据源）</w:t>
               <w:br/>
-              <w:t xml:space="preserve">  │</w:t>
+              <w:t>├── scripts/                 # 【Agent 客户端与独立审计层】</w:t>
               <w:br/>
-              <w:t xml:space="preserve">  ▼</w:t>
+              <w:t>│   ├── client.js            # AI Agent 智能客户端（402谈判、四项安全核查、EIP-3009签名支付）</w:t>
               <w:br/>
-              <w:t>[x402 Facilitator 通道] 验证签名并在 Base Sepolia 链上代付 Gas 完成 USDC 结算</w:t>
+              <w:t>│   ├── reconcile.js         # 链上对账审计脚本（RPC直连区块链，事件形状匹配，不可篡改审计）</w:t>
               <w:br/>
-              <w:t xml:space="preserve">  │</w:t>
+              <w:t>│   └── generate_docx.py     # 自动化 Word 总结汇报生成脚本（python-docx 自动排版）</w:t>
               <w:br/>
-              <w:t xml:space="preserve">  ▼</w:t>
+              <w:t>├── secrets/                 # 【物理级本地密钥隔离目录】（被 .gitignore 彻底忽略）</w:t>
               <w:br/>
-              <w:t>[Vercel / Express 服务端] 校验结算通过，调用底层天气 Provider，返回 200 天气 JSON + 回执头</w:t>
+              <w:t>├── server.js                # 【本地运行入口】（node server.js 监听 3000 端口）</w:t>
               <w:br/>
-              <w:t xml:space="preserve">  │</w:t>
+              <w:t>├── vercel.json              # 【云端路由网关规则】（Serverless 重写与路径无损还原参数）</w:t>
               <w:br/>
-              <w:t xml:space="preserve">  ▼</w:t>
+              <w:t>├── 启动本地天气服务.bat     # 【Windows 一键启动脚本】（CRLF规范，编码优化，自动拉起浏览器）</w:t>
               <w:br/>
-              <w:t>[Agent 客户端 &amp; 对账脚本] 获取实况天气，提取 Tx Hash 直连 RPC 完成链上对账</w:t>
+              <w:t>├── wallet.example.json      # 根目录公开钱包配置模板（供新环境克隆使用）</w:t>
+              <w:br/>
+              <w:t>├── .env.example             # 根目录公开环境变量配置模板</w:t>
+              <w:br/>
+              <w:t>├── .gitignore               # 全局 Git 忽略清单（杜绝私钥、node_modules 泄露）</w:t>
+              <w:br/>
+              <w:t>└── package.json             # 项目元信息、模块化 ESM 声明 ("type": "module")、核心依赖声明</w:t>
             </w:r>
           </w:p>
         </w:tc>
@@ -350,16 +774,96 @@
     <w:p/>
     <w:p>
       <w:pPr>
-        <w:pStyle w:val="Heading1"/>
-        <w:spacing w:before="280" w:after="120"/>
+        <w:pStyle w:val="Heading2"/>
       </w:pPr>
       <w:r>
-        <w:t>二、 核心地址与资产配置清单</w:t>
+        <w:t>1. api/ 目录 —— Serverless 接入层</w:t>
       </w:r>
     </w:p>
     <w:p>
       <w:r>
-        <w:t>系统运行涉及的所有服务公网端点、Web3 钱包、代币合约与官方基础设施地址如下：</w:t>
+        <w:t>• 命名缘由：依据 Vercel Serverless Function 平台规范，api/ 目录下的 index.js 导出 Express 实例后，平台会自动将其识别为无服务器云函数进行弹性扩缩容部署。</w:t>
+        <w:br/>
+        <w:t>• 核心机制：</w:t>
+        <w:br/>
+        <w:t xml:space="preserve">  1) 路由配置与定价绑定：定义 routesConfig，为 GET /api/weather 绑定 price: "$0.001"；</w:t>
+        <w:br/>
+        <w:t xml:space="preserve">  2) x402 中间件拦截：调用 paymentMiddleware(routesConfig, resourceServer)，对未带有效签名的请求自动截断并返还 HTTP 402 与 Base64 结构化账单；</w:t>
+        <w:br/>
+        <w:t xml:space="preserve">  3) 路径无损还原：配合 vercel.json 的 rewrite 参数，将 req.query.__path 动态重置回 req.url，抹平了本地与 Serverless 平台的路径解析差异；</w:t>
+        <w:br/>
+        <w:t xml:space="preserve">  4) 双端点架构：开放免费状态端点 GET /health 与受保护收费端点 GET /api/weather。</w:t>
+      </w:r>
+    </w:p>
+    <w:p>
+      <w:pPr>
+        <w:pStyle w:val="Heading2"/>
+      </w:pPr>
+      <w:r>
+        <w:t>2. src/ 目录 —— 策略解耦与安全配置层</w:t>
+      </w:r>
+    </w:p>
+    <w:p>
+      <w:r>
+        <w:t>• src/config/wallet.js（安全解析层）：</w:t>
+        <w:br/>
+        <w:t xml:space="preserve">  采用防御性编程。配置 candidatePaths 依次检测系统环境变量、当前项目根目录、父级目录及 secrets/ 目录；内置 0x 前缀自愈逻辑，且私钥仅在执行时瞬时装载进局部内存，绝不在日志或异常栈中向外抛出。</w:t>
+        <w:br/>
+        <w:br/>
+        <w:t>• src/providers/（策略模式数据抽象层）：</w:t>
+        <w:br/>
+        <w:t xml:space="preserve">  将「Web3 付费结算逻辑」与「具体天气查询业务」彻底解耦。支付层只认费用与放行信号，业务层负责具体数据生产。</w:t>
+        <w:br/>
+        <w:t xml:space="preserve">  - openmeteo.js：默认源。先调 Geocoding API 把城市名转换为经纬度，再调 Forecast API 取出实时气温、湿度、风速与天气现象，免 Key 免注册；</w:t>
+        <w:br/>
+        <w:t xml:space="preserve">  - amap.js：备选源。内置常用城市中文名称到高德行政区划代码（adcode）字典，调取高德 Web 服务接口；</w:t>
+        <w:br/>
+        <w:t xml:space="preserve">  - index.js：工厂分发。通过环境变量 PROVIDER=openmeteo|amap 实现数据源热切换，符合开闭原则。</w:t>
+      </w:r>
+    </w:p>
+    <w:p>
+      <w:pPr>
+        <w:pStyle w:val="Heading2"/>
+      </w:pPr>
+      <w:r>
+        <w:t>3. scripts/ 目录 —— Agent 自动化与对账审计层</w:t>
+      </w:r>
+    </w:p>
+    <w:p>
+      <w:r>
+        <w:t>• scripts/client.js（AI Agent 决策中枢）：</w:t>
+        <w:br/>
+        <w:t xml:space="preserve">  模拟自主智能体行为。分为三大严密阶段：</w:t>
+        <w:br/>
+        <w:t xml:space="preserve">  1) 未付款初始探测：向服务端发送初始探测，解析 HTTP 402 响应头中的 payment-required 账单；</w:t>
+        <w:br/>
+        <w:t xml:space="preserve">  2) 四项安全规则拦截：对金额（$0.001）、网络（Base Sepolia）、代币（Circle USDC）、收款方地址进行强制断言。非 CONFIRM=yes 时强制挂起，防止资金静默流失；</w:t>
+        <w:br/>
+        <w:t xml:space="preserve">  3) EIP-3009 付款执行：使用 viem/accounts 导出签名者，配合 ExactEvmScheme 与 wrapFetchWithPaymentFromConfig 发起无 Gas 链上签名结算，成功后打印天气数据与结算 Tx Hash。</w:t>
+        <w:br/>
+        <w:br/>
+        <w:t>• scripts/reconcile.js（只读区块链审计系统）：</w:t>
+        <w:br/>
+        <w:t xml:space="preserve">  纯只读链上程序。直连 Base Sepolia RPC，拉取区块收据（Receipt）。通过创新的「事件形状匹配」过滤 Transfer 日志，精确核验扣费金额、双方地址及链上最新余额变动。</w:t>
+        <w:br/>
+        <w:br/>
+        <w:t>• scripts/generate_docx.py（交付报告生成器）：</w:t>
+        <w:br/>
+        <w:t xml:space="preserve">  工程自建交付工具，提取全链路链上凭据，自动输出结构化 Word 总结汇报。</w:t>
+      </w:r>
+    </w:p>
+    <w:p>
+      <w:pPr>
+        <w:pStyle w:val="Heading1"/>
+        <w:spacing w:before="320" w:after="120"/>
+      </w:pPr>
+      <w:r>
+        <w:t>三、 已完成的真实链上结算与对账凭证</w:t>
+      </w:r>
+    </w:p>
+    <w:p>
+      <w:r>
+        <w:t>项目在实测验证阶段已在 Base Sepolia 测试网上完成了 3 笔完全真实的代币划转与上链清算，所有数据均可在以太坊 Layer2 公开区块浏览器 BaseScan 上随时查验：</w:t>
       </w:r>
     </w:p>
     <w:tbl>
@@ -369,9 +873,10 @@
         <w:tblLook w:firstColumn="1" w:firstRow="1" w:lastColumn="0" w:lastRow="0" w:noHBand="0" w:noVBand="1" w:val="04A0"/>
       </w:tblPr>
       <w:tblGrid>
-        <w:gridCol w:w="3120"/>
-        <w:gridCol w:w="3120"/>
-        <w:gridCol w:w="3120"/>
+        <w:gridCol w:w="2268"/>
+        <w:gridCol w:w="2268"/>
+        <w:gridCol w:w="2268"/>
+        <w:gridCol w:w="2268"/>
       </w:tblGrid>
       <w:tr>
         <w:trPr>
@@ -379,13 +884,13 @@
         </w:trPr>
         <w:tc>
           <w:tcPr>
-            <w:tcW w:type="dxa" w:w="3120"/>
+            <w:tcW w:type="dxa" w:w="2268"/>
             <w:vAlign w:val="center"/>
             <w:tcMar>
-              <w:top w:w="120" w:type="dxa"/>
-              <w:bottom w:w="120" w:type="dxa"/>
-              <w:left w:w="180" w:type="dxa"/>
-              <w:right w:w="180" w:type="dxa"/>
+              <w:top w:w="100" w:type="dxa"/>
+              <w:bottom w:w="100" w:type="dxa"/>
+              <w:left w:w="140" w:type="dxa"/>
+              <w:right w:w="140" w:type="dxa"/>
             </w:tcMar>
             <w:shd w:fill="1F497D"/>
           </w:tcPr>
@@ -395,19 +900,19 @@
                 <w:b/>
                 <w:color w:val="FFFFFF"/>
               </w:rPr>
-              <w:t>类别</w:t>
+              <w:t>测试阶段 / 场景</w:t>
             </w:r>
           </w:p>
         </w:tc>
         <w:tc>
           <w:tcPr>
-            <w:tcW w:type="dxa" w:w="3120"/>
+            <w:tcW w:type="dxa" w:w="2268"/>
             <w:vAlign w:val="center"/>
             <w:tcMar>
-              <w:top w:w="120" w:type="dxa"/>
-              <w:bottom w:w="120" w:type="dxa"/>
-              <w:left w:w="180" w:type="dxa"/>
-              <w:right w:w="180" w:type="dxa"/>
+              <w:top w:w="100" w:type="dxa"/>
+              <w:bottom w:w="100" w:type="dxa"/>
+              <w:left w:w="140" w:type="dxa"/>
+              <w:right w:w="140" w:type="dxa"/>
             </w:tcMar>
             <w:shd w:fill="1F497D"/>
           </w:tcPr>
@@ -417,19 +922,19 @@
                 <w:b/>
                 <w:color w:val="FFFFFF"/>
               </w:rPr>
-              <w:t>配置项 / 属性</w:t>
+              <w:t>交易哈希 (Tx Hash)</w:t>
             </w:r>
           </w:p>
         </w:tc>
         <w:tc>
           <w:tcPr>
-            <w:tcW w:type="dxa" w:w="3120"/>
+            <w:tcW w:type="dxa" w:w="2268"/>
             <w:vAlign w:val="center"/>
             <w:tcMar>
-              <w:top w:w="120" w:type="dxa"/>
-              <w:bottom w:w="120" w:type="dxa"/>
-              <w:left w:w="180" w:type="dxa"/>
-              <w:right w:w="180" w:type="dxa"/>
+              <w:top w:w="100" w:type="dxa"/>
+              <w:bottom w:w="100" w:type="dxa"/>
+              <w:left w:w="140" w:type="dxa"/>
+              <w:right w:w="140" w:type="dxa"/>
             </w:tcMar>
             <w:shd w:fill="1F497D"/>
           </w:tcPr>
@@ -439,7 +944,29 @@
                 <w:b/>
                 <w:color w:val="FFFFFF"/>
               </w:rPr>
-              <w:t>具体地址 / 链接</w:t>
+              <w:t>链上状态</w:t>
+            </w:r>
+          </w:p>
+        </w:tc>
+        <w:tc>
+          <w:tcPr>
+            <w:tcW w:type="dxa" w:w="2268"/>
+            <w:vAlign w:val="center"/>
+            <w:tcMar>
+              <w:top w:w="100" w:type="dxa"/>
+              <w:bottom w:w="100" w:type="dxa"/>
+              <w:left w:w="140" w:type="dxa"/>
+              <w:right w:w="140" w:type="dxa"/>
+            </w:tcMar>
+            <w:shd w:fill="1F497D"/>
+          </w:tcPr>
+          <w:p>
+            <w:r>
+              <w:rPr>
+                <w:b/>
+                <w:color w:val="FFFFFF"/>
+              </w:rPr>
+              <w:t>区块高度与 Gas 结算</w:t>
             </w:r>
           </w:p>
         </w:tc>
@@ -450,67 +977,73 @@
         </w:trPr>
         <w:tc>
           <w:tcPr>
-            <w:tcW w:type="dxa" w:w="3120"/>
+            <w:tcW w:type="dxa" w:w="2268"/>
             <w:vAlign w:val="center"/>
             <w:tcMar>
-              <w:top w:w="120" w:type="dxa"/>
-              <w:bottom w:w="120" w:type="dxa"/>
-              <w:left w:w="180" w:type="dxa"/>
-              <w:right w:w="180" w:type="dxa"/>
+              <w:top w:w="100" w:type="dxa"/>
+              <w:bottom w:w="100" w:type="dxa"/>
+              <w:left w:w="140" w:type="dxa"/>
+              <w:right w:w="140" w:type="dxa"/>
             </w:tcMar>
             <w:shd w:fill="F2F5F9"/>
           </w:tcPr>
           <w:p>
             <w:r>
-              <w:rPr>
-                <w:rFonts w:ascii="微软雅黑" w:hAnsi="微软雅黑"/>
-                <w:sz w:val="18"/>
-              </w:rPr>
-              <w:t>云端生产环境</w:t>
+              <w:t>1. 本地测试阶段 (北京)</w:t>
             </w:r>
           </w:p>
         </w:tc>
         <w:tc>
           <w:tcPr>
-            <w:tcW w:type="dxa" w:w="3120"/>
+            <w:tcW w:type="dxa" w:w="2268"/>
             <w:vAlign w:val="center"/>
             <w:tcMar>
-              <w:top w:w="120" w:type="dxa"/>
-              <w:bottom w:w="120" w:type="dxa"/>
-              <w:left w:w="180" w:type="dxa"/>
-              <w:right w:w="180" w:type="dxa"/>
+              <w:top w:w="100" w:type="dxa"/>
+              <w:bottom w:w="100" w:type="dxa"/>
+              <w:left w:w="140" w:type="dxa"/>
+              <w:right w:w="140" w:type="dxa"/>
             </w:tcMar>
             <w:shd w:fill="F2F5F9"/>
           </w:tcPr>
           <w:p>
             <w:r>
-              <w:rPr>
-                <w:rFonts w:ascii="微软雅黑" w:hAnsi="微软雅黑"/>
-                <w:sz w:val="18"/>
-              </w:rPr>
-              <w:t>Vercel 生产主域名</w:t>
+              <w:t>0x1899a7b38ebf4af00d0e6a53e89d953c53d0fb5bdea9204c27a439a3ba4f657e</w:t>
             </w:r>
           </w:p>
         </w:tc>
         <w:tc>
           <w:tcPr>
-            <w:tcW w:type="dxa" w:w="3120"/>
+            <w:tcW w:type="dxa" w:w="2268"/>
             <w:vAlign w:val="center"/>
             <w:tcMar>
-              <w:top w:w="120" w:type="dxa"/>
-              <w:bottom w:w="120" w:type="dxa"/>
-              <w:left w:w="180" w:type="dxa"/>
-              <w:right w:w="180" w:type="dxa"/>
+              <w:top w:w="100" w:type="dxa"/>
+              <w:bottom w:w="100" w:type="dxa"/>
+              <w:left w:w="140" w:type="dxa"/>
+              <w:right w:w="140" w:type="dxa"/>
             </w:tcMar>
             <w:shd w:fill="F2F5F9"/>
           </w:tcPr>
           <w:p>
             <w:r>
-              <w:rPr>
-                <w:rFonts w:ascii="Consolas" w:hAnsi="Consolas"/>
-                <w:sz w:val="18"/>
-              </w:rPr>
-              <w:t>https://x402-weather-service.vercel.app</w:t>
+              <w:t>✅ 成功 (success)</w:t>
+            </w:r>
+          </w:p>
+        </w:tc>
+        <w:tc>
+          <w:tcPr>
+            <w:tcW w:type="dxa" w:w="2268"/>
+            <w:vAlign w:val="center"/>
+            <w:tcMar>
+              <w:top w:w="100" w:type="dxa"/>
+              <w:bottom w:w="100" w:type="dxa"/>
+              <w:left w:w="140" w:type="dxa"/>
+              <w:right w:w="140" w:type="dxa"/>
+            </w:tcMar>
+            <w:shd w:fill="F2F5F9"/>
+          </w:tcPr>
+          <w:p>
+            <w:r>
+              <w:t>Gas 代付: 85728 (0 费率)</w:t>
             </w:r>
           </w:p>
         </w:tc>
@@ -521,67 +1054,73 @@
         </w:trPr>
         <w:tc>
           <w:tcPr>
-            <w:tcW w:type="dxa" w:w="3120"/>
+            <w:tcW w:type="dxa" w:w="2268"/>
             <w:vAlign w:val="center"/>
             <w:tcMar>
-              <w:top w:w="120" w:type="dxa"/>
-              <w:bottom w:w="120" w:type="dxa"/>
-              <w:left w:w="180" w:type="dxa"/>
-              <w:right w:w="180" w:type="dxa"/>
+              <w:top w:w="100" w:type="dxa"/>
+              <w:bottom w:w="100" w:type="dxa"/>
+              <w:left w:w="140" w:type="dxa"/>
+              <w:right w:w="140" w:type="dxa"/>
             </w:tcMar>
             <w:shd w:fill="FFFFFF"/>
           </w:tcPr>
           <w:p>
             <w:r>
-              <w:rPr>
-                <w:rFonts w:ascii="微软雅黑" w:hAnsi="微软雅黑"/>
-                <w:sz w:val="18"/>
-              </w:rPr>
-              <w:t>云端生产环境</w:t>
+              <w:t>2. Vercel 公网阶段 (北京)</w:t>
             </w:r>
           </w:p>
         </w:tc>
         <w:tc>
           <w:tcPr>
-            <w:tcW w:type="dxa" w:w="3120"/>
+            <w:tcW w:type="dxa" w:w="2268"/>
             <w:vAlign w:val="center"/>
             <w:tcMar>
-              <w:top w:w="120" w:type="dxa"/>
-              <w:bottom w:w="120" w:type="dxa"/>
-              <w:left w:w="180" w:type="dxa"/>
-              <w:right w:w="180" w:type="dxa"/>
+              <w:top w:w="100" w:type="dxa"/>
+              <w:bottom w:w="100" w:type="dxa"/>
+              <w:left w:w="140" w:type="dxa"/>
+              <w:right w:w="140" w:type="dxa"/>
             </w:tcMar>
             <w:shd w:fill="FFFFFF"/>
           </w:tcPr>
           <w:p>
             <w:r>
-              <w:rPr>
-                <w:rFonts w:ascii="微软雅黑" w:hAnsi="微软雅黑"/>
-                <w:sz w:val="18"/>
-              </w:rPr>
-              <w:t>免费健康检查接口</w:t>
+              <w:t>0x587fd1284cbc8d49ec9ce9c31f4998001c270bd6a0492d97c1a869473cc9b352</w:t>
             </w:r>
           </w:p>
         </w:tc>
         <w:tc>
           <w:tcPr>
-            <w:tcW w:type="dxa" w:w="3120"/>
+            <w:tcW w:type="dxa" w:w="2268"/>
             <w:vAlign w:val="center"/>
             <w:tcMar>
-              <w:top w:w="120" w:type="dxa"/>
-              <w:bottom w:w="120" w:type="dxa"/>
-              <w:left w:w="180" w:type="dxa"/>
-              <w:right w:w="180" w:type="dxa"/>
+              <w:top w:w="100" w:type="dxa"/>
+              <w:bottom w:w="100" w:type="dxa"/>
+              <w:left w:w="140" w:type="dxa"/>
+              <w:right w:w="140" w:type="dxa"/>
             </w:tcMar>
             <w:shd w:fill="FFFFFF"/>
           </w:tcPr>
           <w:p>
             <w:r>
-              <w:rPr>
-                <w:rFonts w:ascii="Consolas" w:hAnsi="Consolas"/>
-                <w:sz w:val="18"/>
-              </w:rPr>
-              <w:t>https://x402-weather-service.vercel.app/health</w:t>
+              <w:t>✅ 成功 (success)</w:t>
+            </w:r>
+          </w:p>
+        </w:tc>
+        <w:tc>
+          <w:tcPr>
+            <w:tcW w:type="dxa" w:w="2268"/>
+            <w:vAlign w:val="center"/>
+            <w:tcMar>
+              <w:top w:w="100" w:type="dxa"/>
+              <w:bottom w:w="100" w:type="dxa"/>
+              <w:left w:w="140" w:type="dxa"/>
+              <w:right w:w="140" w:type="dxa"/>
+            </w:tcMar>
+            <w:shd w:fill="FFFFFF"/>
+          </w:tcPr>
+          <w:p>
+            <w:r>
+              <w:t>区块 #48365375 (Facilitator 代付)</w:t>
             </w:r>
           </w:p>
         </w:tc>
@@ -592,422 +1131,129 @@
         </w:trPr>
         <w:tc>
           <w:tcPr>
-            <w:tcW w:type="dxa" w:w="3120"/>
+            <w:tcW w:type="dxa" w:w="2268"/>
             <w:vAlign w:val="center"/>
+            <w:tcMar>
+              <w:top w:w="100" w:type="dxa"/>
+              <w:bottom w:w="100" w:type="dxa"/>
+              <w:left w:w="140" w:type="dxa"/>
+              <w:right w:w="140" w:type="dxa"/>
+            </w:tcMar>
+            <w:shd w:fill="F2F5F9"/>
+          </w:tcPr>
+          <w:p>
+            <w:r>
+              <w:t>3. 现场实测阶段 (深圳)</w:t>
+            </w:r>
+          </w:p>
+        </w:tc>
+        <w:tc>
+          <w:tcPr>
+            <w:tcW w:type="dxa" w:w="2268"/>
+            <w:vAlign w:val="center"/>
+            <w:tcMar>
+              <w:top w:w="100" w:type="dxa"/>
+              <w:bottom w:w="100" w:type="dxa"/>
+              <w:left w:w="140" w:type="dxa"/>
+              <w:right w:w="140" w:type="dxa"/>
+            </w:tcMar>
+            <w:shd w:fill="F2F5F9"/>
+          </w:tcPr>
+          <w:p>
+            <w:r>
+              <w:t>0x5c258d23a6e8ca252ba228f347e44cd4913327462a31d02faab8e9cc6729bacd</w:t>
+            </w:r>
+          </w:p>
+        </w:tc>
+        <w:tc>
+          <w:tcPr>
+            <w:tcW w:type="dxa" w:w="2268"/>
+            <w:vAlign w:val="center"/>
+            <w:tcMar>
+              <w:top w:w="100" w:type="dxa"/>
+              <w:bottom w:w="100" w:type="dxa"/>
+              <w:left w:w="140" w:type="dxa"/>
+              <w:right w:w="140" w:type="dxa"/>
+            </w:tcMar>
+            <w:shd w:fill="F2F5F9"/>
+          </w:tcPr>
+          <w:p>
+            <w:r>
+              <w:t>✅ 成功 (success)</w:t>
+            </w:r>
+          </w:p>
+        </w:tc>
+        <w:tc>
+          <w:tcPr>
+            <w:tcW w:type="dxa" w:w="2268"/>
+            <w:vAlign w:val="center"/>
+            <w:tcMar>
+              <w:top w:w="100" w:type="dxa"/>
+              <w:bottom w:w="100" w:type="dxa"/>
+              <w:left w:w="140" w:type="dxa"/>
+              <w:right w:w="140" w:type="dxa"/>
+            </w:tcMar>
+            <w:shd w:fill="F2F5F9"/>
+          </w:tcPr>
+          <w:p>
+            <w:r>
+              <w:t>区块 #48566530 (扣除 0.001 USDC)</w:t>
+            </w:r>
+          </w:p>
+        </w:tc>
+      </w:tr>
+    </w:tbl>
+    <w:p/>
+    <w:tbl>
+      <w:tblPr>
+        <w:tblW w:type="auto" w:w="0"/>
+        <w:jc w:val="center"/>
+        <w:tblLook w:firstColumn="1" w:firstRow="1" w:lastColumn="0" w:lastRow="0" w:noHBand="0" w:noVBand="1" w:val="04A0"/>
+      </w:tblPr>
+      <w:tblGrid>
+        <w:gridCol w:w="9072"/>
+      </w:tblGrid>
+      <w:tr>
+        <w:tc>
+          <w:tcPr>
+            <w:tcW w:type="dxa" w:w="9072"/>
+            <w:shd w:fill="EFF6FF"/>
             <w:tcMar>
               <w:top w:w="120" w:type="dxa"/>
               <w:bottom w:w="120" w:type="dxa"/>
               <w:left w:w="180" w:type="dxa"/>
               <w:right w:w="180" w:type="dxa"/>
             </w:tcMar>
-            <w:shd w:fill="F2F5F9"/>
+            <w:tcBorders>
+              <w:left w:val="single" w:sz="24" w:space="0" w:color="1F497D"/>
+              <w:top w:val="none"/>
+              <w:right w:val="none"/>
+              <w:bottom w:val="none"/>
+            </w:tcBorders>
           </w:tcPr>
           <w:p>
+            <w:pPr>
+              <w:spacing w:before="40" w:after="40"/>
+            </w:pPr>
             <w:r>
               <w:rPr>
-                <w:rFonts w:ascii="微软雅黑" w:hAnsi="微软雅黑"/>
-                <w:sz w:val="18"/>
+                <w:b/>
+                <w:color w:val="1F497D"/>
+                <w:sz w:val="20"/>
               </w:rPr>
-              <w:t>云端生产环境</w:t>
+              <w:t>💰 双方钱包链上资金真实变动轨迹（原子级审计）</w:t>
+              <w:br/>
             </w:r>
-          </w:p>
-        </w:tc>
-        <w:tc>
-          <w:tcPr>
-            <w:tcW w:type="dxa" w:w="3120"/>
-            <w:vAlign w:val="center"/>
-            <w:tcMar>
-              <w:top w:w="120" w:type="dxa"/>
-              <w:bottom w:w="120" w:type="dxa"/>
-              <w:left w:w="180" w:type="dxa"/>
-              <w:right w:w="180" w:type="dxa"/>
-            </w:tcMar>
-            <w:shd w:fill="F2F5F9"/>
-          </w:tcPr>
-          <w:p>
             <w:r>
               <w:rPr>
-                <w:rFonts w:ascii="微软雅黑" w:hAnsi="微软雅黑"/>
-                <w:sz w:val="18"/>
+                <w:color w:val="333333"/>
+                <w:sz w:val="19"/>
               </w:rPr>
-              <w:t>付费天气 API 接口</w:t>
-            </w:r>
-          </w:p>
-        </w:tc>
-        <w:tc>
-          <w:tcPr>
-            <w:tcW w:type="dxa" w:w="3120"/>
-            <w:vAlign w:val="center"/>
-            <w:tcMar>
-              <w:top w:w="120" w:type="dxa"/>
-              <w:bottom w:w="120" w:type="dxa"/>
-              <w:left w:w="180" w:type="dxa"/>
-              <w:right w:w="180" w:type="dxa"/>
-            </w:tcMar>
-            <w:shd w:fill="F2F5F9"/>
-          </w:tcPr>
-          <w:p>
-            <w:r>
-              <w:rPr>
-                <w:rFonts w:ascii="Consolas" w:hAnsi="Consolas"/>
-                <w:sz w:val="18"/>
-              </w:rPr>
-              <w:t>https://x402-weather-service.vercel.app/api/weather?city=北京</w:t>
-            </w:r>
-          </w:p>
-        </w:tc>
-      </w:tr>
-      <w:tr>
-        <w:trPr>
-          <w:cantSplit/>
-        </w:trPr>
-        <w:tc>
-          <w:tcPr>
-            <w:tcW w:type="dxa" w:w="3120"/>
-            <w:vAlign w:val="center"/>
-            <w:tcMar>
-              <w:top w:w="120" w:type="dxa"/>
-              <w:bottom w:w="120" w:type="dxa"/>
-              <w:left w:w="180" w:type="dxa"/>
-              <w:right w:w="180" w:type="dxa"/>
-            </w:tcMar>
-            <w:shd w:fill="FFFFFF"/>
-          </w:tcPr>
-          <w:p>
-            <w:r>
-              <w:rPr>
-                <w:rFonts w:ascii="微软雅黑" w:hAnsi="微软雅黑"/>
-                <w:sz w:val="18"/>
-              </w:rPr>
-              <w:t>Web3 钱包</w:t>
-            </w:r>
-          </w:p>
-        </w:tc>
-        <w:tc>
-          <w:tcPr>
-            <w:tcW w:type="dxa" w:w="3120"/>
-            <w:vAlign w:val="center"/>
-            <w:tcMar>
-              <w:top w:w="120" w:type="dxa"/>
-              <w:bottom w:w="120" w:type="dxa"/>
-              <w:left w:w="180" w:type="dxa"/>
-              <w:right w:w="180" w:type="dxa"/>
-            </w:tcMar>
-            <w:shd w:fill="FFFFFF"/>
-          </w:tcPr>
-          <w:p>
-            <w:r>
-              <w:rPr>
-                <w:rFonts w:ascii="微软雅黑" w:hAnsi="微软雅黑"/>
-                <w:sz w:val="18"/>
-              </w:rPr>
-              <w:t>Agent 付款钱包 (Payer)</w:t>
-            </w:r>
-          </w:p>
-        </w:tc>
-        <w:tc>
-          <w:tcPr>
-            <w:tcW w:type="dxa" w:w="3120"/>
-            <w:vAlign w:val="center"/>
-            <w:tcMar>
-              <w:top w:w="120" w:type="dxa"/>
-              <w:bottom w:w="120" w:type="dxa"/>
-              <w:left w:w="180" w:type="dxa"/>
-              <w:right w:w="180" w:type="dxa"/>
-            </w:tcMar>
-            <w:shd w:fill="FFFFFF"/>
-          </w:tcPr>
-          <w:p>
-            <w:r>
-              <w:rPr>
-                <w:rFonts w:ascii="Consolas" w:hAnsi="Consolas"/>
-                <w:sz w:val="18"/>
-              </w:rPr>
-              <w:t>0x4830D4857AdA8b000aFC1C2702294B0999dEaFB3</w:t>
-            </w:r>
-          </w:p>
-        </w:tc>
-      </w:tr>
-      <w:tr>
-        <w:trPr>
-          <w:cantSplit/>
-        </w:trPr>
-        <w:tc>
-          <w:tcPr>
-            <w:tcW w:type="dxa" w:w="3120"/>
-            <w:vAlign w:val="center"/>
-            <w:tcMar>
-              <w:top w:w="120" w:type="dxa"/>
-              <w:bottom w:w="120" w:type="dxa"/>
-              <w:left w:w="180" w:type="dxa"/>
-              <w:right w:w="180" w:type="dxa"/>
-            </w:tcMar>
-            <w:shd w:fill="F2F5F9"/>
-          </w:tcPr>
-          <w:p>
-            <w:r>
-              <w:rPr>
-                <w:rFonts w:ascii="微软雅黑" w:hAnsi="微软雅黑"/>
-                <w:sz w:val="18"/>
-              </w:rPr>
-              <w:t>Web3 钱包</w:t>
-            </w:r>
-          </w:p>
-        </w:tc>
-        <w:tc>
-          <w:tcPr>
-            <w:tcW w:type="dxa" w:w="3120"/>
-            <w:vAlign w:val="center"/>
-            <w:tcMar>
-              <w:top w:w="120" w:type="dxa"/>
-              <w:bottom w:w="120" w:type="dxa"/>
-              <w:left w:w="180" w:type="dxa"/>
-              <w:right w:w="180" w:type="dxa"/>
-            </w:tcMar>
-            <w:shd w:fill="F2F5F9"/>
-          </w:tcPr>
-          <w:p>
-            <w:r>
-              <w:rPr>
-                <w:rFonts w:ascii="微软雅黑" w:hAnsi="微软雅黑"/>
-                <w:sz w:val="18"/>
-              </w:rPr>
-              <w:t>服务端收款钱包 (PayTo)</w:t>
-            </w:r>
-          </w:p>
-        </w:tc>
-        <w:tc>
-          <w:tcPr>
-            <w:tcW w:type="dxa" w:w="3120"/>
-            <w:vAlign w:val="center"/>
-            <w:tcMar>
-              <w:top w:w="120" w:type="dxa"/>
-              <w:bottom w:w="120" w:type="dxa"/>
-              <w:left w:w="180" w:type="dxa"/>
-              <w:right w:w="180" w:type="dxa"/>
-            </w:tcMar>
-            <w:shd w:fill="F2F5F9"/>
-          </w:tcPr>
-          <w:p>
-            <w:r>
-              <w:rPr>
-                <w:rFonts w:ascii="Consolas" w:hAnsi="Consolas"/>
-                <w:sz w:val="18"/>
-              </w:rPr>
-              <w:t>0xdcD7DAFafb0EF3d50bDdB480Dbd503Fa6D1B6C09</w:t>
-            </w:r>
-          </w:p>
-        </w:tc>
-      </w:tr>
-      <w:tr>
-        <w:trPr>
-          <w:cantSplit/>
-        </w:trPr>
-        <w:tc>
-          <w:tcPr>
-            <w:tcW w:type="dxa" w:w="3120"/>
-            <w:vAlign w:val="center"/>
-            <w:tcMar>
-              <w:top w:w="120" w:type="dxa"/>
-              <w:bottom w:w="120" w:type="dxa"/>
-              <w:left w:w="180" w:type="dxa"/>
-              <w:right w:w="180" w:type="dxa"/>
-            </w:tcMar>
-            <w:shd w:fill="FFFFFF"/>
-          </w:tcPr>
-          <w:p>
-            <w:r>
-              <w:rPr>
-                <w:rFonts w:ascii="微软雅黑" w:hAnsi="微软雅黑"/>
-                <w:sz w:val="18"/>
-              </w:rPr>
-              <w:t>结算代币</w:t>
-            </w:r>
-          </w:p>
-        </w:tc>
-        <w:tc>
-          <w:tcPr>
-            <w:tcW w:type="dxa" w:w="3120"/>
-            <w:vAlign w:val="center"/>
-            <w:tcMar>
-              <w:top w:w="120" w:type="dxa"/>
-              <w:bottom w:w="120" w:type="dxa"/>
-              <w:left w:w="180" w:type="dxa"/>
-              <w:right w:w="180" w:type="dxa"/>
-            </w:tcMar>
-            <w:shd w:fill="FFFFFF"/>
-          </w:tcPr>
-          <w:p>
-            <w:r>
-              <w:rPr>
-                <w:rFonts w:ascii="微软雅黑" w:hAnsi="微软雅黑"/>
-                <w:sz w:val="18"/>
-              </w:rPr>
-              <w:t>官方 Circle 测试 USDC</w:t>
-            </w:r>
-          </w:p>
-        </w:tc>
-        <w:tc>
-          <w:tcPr>
-            <w:tcW w:type="dxa" w:w="3120"/>
-            <w:vAlign w:val="center"/>
-            <w:tcMar>
-              <w:top w:w="120" w:type="dxa"/>
-              <w:bottom w:w="120" w:type="dxa"/>
-              <w:left w:w="180" w:type="dxa"/>
-              <w:right w:w="180" w:type="dxa"/>
-            </w:tcMar>
-            <w:shd w:fill="FFFFFF"/>
-          </w:tcPr>
-          <w:p>
-            <w:r>
-              <w:rPr>
-                <w:rFonts w:ascii="Consolas" w:hAnsi="Consolas"/>
-                <w:sz w:val="18"/>
-              </w:rPr>
-              <w:t>0x036CbD53842c5426634e7929541eC2318f3dCF7e (精度: 6位)</w:t>
-            </w:r>
-          </w:p>
-        </w:tc>
-      </w:tr>
-      <w:tr>
-        <w:trPr>
-          <w:cantSplit/>
-        </w:trPr>
-        <w:tc>
-          <w:tcPr>
-            <w:tcW w:type="dxa" w:w="3120"/>
-            <w:vAlign w:val="center"/>
-            <w:tcMar>
-              <w:top w:w="120" w:type="dxa"/>
-              <w:bottom w:w="120" w:type="dxa"/>
-              <w:left w:w="180" w:type="dxa"/>
-              <w:right w:w="180" w:type="dxa"/>
-            </w:tcMar>
-            <w:shd w:fill="F2F5F9"/>
-          </w:tcPr>
-          <w:p>
-            <w:r>
-              <w:rPr>
-                <w:rFonts w:ascii="微软雅黑" w:hAnsi="微软雅黑"/>
-                <w:sz w:val="18"/>
-              </w:rPr>
-              <w:t>底层区块链</w:t>
-            </w:r>
-          </w:p>
-        </w:tc>
-        <w:tc>
-          <w:tcPr>
-            <w:tcW w:type="dxa" w:w="3120"/>
-            <w:vAlign w:val="center"/>
-            <w:tcMar>
-              <w:top w:w="120" w:type="dxa"/>
-              <w:bottom w:w="120" w:type="dxa"/>
-              <w:left w:w="180" w:type="dxa"/>
-              <w:right w:w="180" w:type="dxa"/>
-            </w:tcMar>
-            <w:shd w:fill="F2F5F9"/>
-          </w:tcPr>
-          <w:p>
-            <w:r>
-              <w:rPr>
-                <w:rFonts w:ascii="微软雅黑" w:hAnsi="微软雅黑"/>
-                <w:sz w:val="18"/>
-              </w:rPr>
-              <w:t>结算网络与 CAIP-2</w:t>
-            </w:r>
-          </w:p>
-        </w:tc>
-        <w:tc>
-          <w:tcPr>
-            <w:tcW w:type="dxa" w:w="3120"/>
-            <w:vAlign w:val="center"/>
-            <w:tcMar>
-              <w:top w:w="120" w:type="dxa"/>
-              <w:bottom w:w="120" w:type="dxa"/>
-              <w:left w:w="180" w:type="dxa"/>
-              <w:right w:w="180" w:type="dxa"/>
-            </w:tcMar>
-            <w:shd w:fill="F2F5F9"/>
-          </w:tcPr>
-          <w:p>
-            <w:r>
-              <w:rPr>
-                <w:rFonts w:ascii="Consolas" w:hAnsi="Consolas"/>
-                <w:sz w:val="18"/>
-              </w:rPr>
-              <w:t>Base Sepolia 测试网 (eip155:84532)</w:t>
-            </w:r>
-          </w:p>
-        </w:tc>
-      </w:tr>
-      <w:tr>
-        <w:trPr>
-          <w:cantSplit/>
-        </w:trPr>
-        <w:tc>
-          <w:tcPr>
-            <w:tcW w:type="dxa" w:w="3120"/>
-            <w:vAlign w:val="center"/>
-            <w:tcMar>
-              <w:top w:w="120" w:type="dxa"/>
-              <w:bottom w:w="120" w:type="dxa"/>
-              <w:left w:w="180" w:type="dxa"/>
-              <w:right w:w="180" w:type="dxa"/>
-            </w:tcMar>
-            <w:shd w:fill="FFFFFF"/>
-          </w:tcPr>
-          <w:p>
-            <w:r>
-              <w:rPr>
-                <w:rFonts w:ascii="微软雅黑" w:hAnsi="微软雅黑"/>
-                <w:sz w:val="18"/>
-              </w:rPr>
-              <w:t>协议基础设施</w:t>
-            </w:r>
-          </w:p>
-        </w:tc>
-        <w:tc>
-          <w:tcPr>
-            <w:tcW w:type="dxa" w:w="3120"/>
-            <w:vAlign w:val="center"/>
-            <w:tcMar>
-              <w:top w:w="120" w:type="dxa"/>
-              <w:bottom w:w="120" w:type="dxa"/>
-              <w:left w:w="180" w:type="dxa"/>
-              <w:right w:w="180" w:type="dxa"/>
-            </w:tcMar>
-            <w:shd w:fill="FFFFFF"/>
-          </w:tcPr>
-          <w:p>
-            <w:r>
-              <w:rPr>
-                <w:rFonts w:ascii="微软雅黑" w:hAnsi="微软雅黑"/>
-                <w:sz w:val="18"/>
-              </w:rPr>
-              <w:t>公共 Facilitator 服务</w:t>
-            </w:r>
-          </w:p>
-        </w:tc>
-        <w:tc>
-          <w:tcPr>
-            <w:tcW w:type="dxa" w:w="3120"/>
-            <w:vAlign w:val="center"/>
-            <w:tcMar>
-              <w:top w:w="120" w:type="dxa"/>
-              <w:bottom w:w="120" w:type="dxa"/>
-              <w:left w:w="180" w:type="dxa"/>
-              <w:right w:w="180" w:type="dxa"/>
-            </w:tcMar>
-            <w:shd w:fill="FFFFFF"/>
-          </w:tcPr>
-          <w:p>
-            <w:r>
-              <w:rPr>
-                <w:rFonts w:ascii="Consolas" w:hAnsi="Consolas"/>
-                <w:sz w:val="18"/>
-              </w:rPr>
-              <w:t>https://x402.org/facilitator (免 Key, 测试网代付)</w:t>
+              <w:t>• 付款方钱包 (Agent Payer): 初始 19.998 USDC ──&gt; 经三次实测调用现为 19.995 USDC (每次精确扣减 0.001)</w:t>
+              <w:br/>
+              <w:t>• 收款方钱包 (Server PayTo): 初始 30.002 USDC ──&gt; 经三次实测调用现为 30.005 USDC (每次精确到账 +0.001)</w:t>
+              <w:br/>
+              <w:t>• 对账审计结论：双方账户在链上的资金划转严丝合缝，与账单金额完全一致，无任何多余扣款或滑点损失。</w:t>
             </w:r>
           </w:p>
         </w:tc>
@@ -1017,928 +1263,244 @@
     <w:p>
       <w:pPr>
         <w:pStyle w:val="Heading1"/>
-        <w:spacing w:before="280" w:after="120"/>
+        <w:spacing w:before="320" w:after="120"/>
       </w:pPr>
       <w:r>
-        <w:t>三、 5 大验收标准实测核验与链上凭据</w:t>
-      </w:r>
-    </w:p>
-    <w:tbl>
-      <w:tblPr>
-        <w:tblW w:type="auto" w:w="0"/>
-        <w:jc w:val="center"/>
-        <w:tblLook w:firstColumn="1" w:firstRow="1" w:lastColumn="0" w:lastRow="0" w:noHBand="0" w:noVBand="1" w:val="04A0"/>
-      </w:tblPr>
-      <w:tblGrid>
-        <w:gridCol w:w="2340"/>
-        <w:gridCol w:w="2340"/>
-        <w:gridCol w:w="2340"/>
-        <w:gridCol w:w="2340"/>
-      </w:tblGrid>
-      <w:tr>
-        <w:trPr>
-          <w:cantSplit/>
-        </w:trPr>
-        <w:tc>
-          <w:tcPr>
-            <w:tcW w:type="dxa" w:w="2340"/>
-            <w:vAlign w:val="center"/>
-            <w:tcMar>
-              <w:top w:w="120" w:type="dxa"/>
-              <w:bottom w:w="120" w:type="dxa"/>
-              <w:left w:w="180" w:type="dxa"/>
-              <w:right w:w="180" w:type="dxa"/>
-            </w:tcMar>
-            <w:shd w:fill="1F497D"/>
-          </w:tcPr>
-          <w:p>
-            <w:r>
-              <w:rPr>
-                <w:b/>
-                <w:color w:val="FFFFFF"/>
-              </w:rPr>
-              <w:t>验收标准</w:t>
-            </w:r>
-          </w:p>
-        </w:tc>
-        <w:tc>
-          <w:tcPr>
-            <w:tcW w:type="dxa" w:w="2340"/>
-            <w:vAlign w:val="center"/>
-            <w:tcMar>
-              <w:top w:w="120" w:type="dxa"/>
-              <w:bottom w:w="120" w:type="dxa"/>
-              <w:left w:w="180" w:type="dxa"/>
-              <w:right w:w="180" w:type="dxa"/>
-            </w:tcMar>
-            <w:shd w:fill="1F497D"/>
-          </w:tcPr>
-          <w:p>
-            <w:r>
-              <w:rPr>
-                <w:b/>
-                <w:color w:val="FFFFFF"/>
-              </w:rPr>
-              <w:t>测试内容</w:t>
-            </w:r>
-          </w:p>
-        </w:tc>
-        <w:tc>
-          <w:tcPr>
-            <w:tcW w:type="dxa" w:w="2340"/>
-            <w:vAlign w:val="center"/>
-            <w:tcMar>
-              <w:top w:w="120" w:type="dxa"/>
-              <w:bottom w:w="120" w:type="dxa"/>
-              <w:left w:w="180" w:type="dxa"/>
-              <w:right w:w="180" w:type="dxa"/>
-            </w:tcMar>
-            <w:shd w:fill="1F497D"/>
-          </w:tcPr>
-          <w:p>
-            <w:r>
-              <w:rPr>
-                <w:b/>
-                <w:color w:val="FFFFFF"/>
-              </w:rPr>
-              <w:t>实测结果</w:t>
-            </w:r>
-          </w:p>
-        </w:tc>
-        <w:tc>
-          <w:tcPr>
-            <w:tcW w:type="dxa" w:w="2340"/>
-            <w:vAlign w:val="center"/>
-            <w:tcMar>
-              <w:top w:w="120" w:type="dxa"/>
-              <w:bottom w:w="120" w:type="dxa"/>
-              <w:left w:w="180" w:type="dxa"/>
-              <w:right w:w="180" w:type="dxa"/>
-            </w:tcMar>
-            <w:shd w:fill="1F497D"/>
-          </w:tcPr>
-          <w:p>
-            <w:r>
-              <w:rPr>
-                <w:b/>
-                <w:color w:val="FFFFFF"/>
-              </w:rPr>
-              <w:t>链上交易哈希 / 响应状态</w:t>
-            </w:r>
-          </w:p>
-        </w:tc>
-      </w:tr>
-      <w:tr>
-        <w:trPr>
-          <w:cantSplit/>
-        </w:trPr>
-        <w:tc>
-          <w:tcPr>
-            <w:tcW w:type="dxa" w:w="2340"/>
-            <w:vAlign w:val="center"/>
-            <w:tcMar>
-              <w:top w:w="120" w:type="dxa"/>
-              <w:bottom w:w="120" w:type="dxa"/>
-              <w:left w:w="180" w:type="dxa"/>
-              <w:right w:w="180" w:type="dxa"/>
-            </w:tcMar>
-            <w:shd w:fill="F2F5F9"/>
-          </w:tcPr>
-          <w:p>
-            <w:r>
-              <w:rPr>
-                <w:rFonts w:ascii="微软雅黑" w:hAnsi="微软雅黑"/>
-                <w:sz w:val="19"/>
-              </w:rPr>
-              <w:t>标准 1</w:t>
-            </w:r>
-          </w:p>
-        </w:tc>
-        <w:tc>
-          <w:tcPr>
-            <w:tcW w:type="dxa" w:w="2340"/>
-            <w:vAlign w:val="center"/>
-            <w:tcMar>
-              <w:top w:w="120" w:type="dxa"/>
-              <w:bottom w:w="120" w:type="dxa"/>
-              <w:left w:w="180" w:type="dxa"/>
-              <w:right w:w="180" w:type="dxa"/>
-            </w:tcMar>
-            <w:shd w:fill="F2F5F9"/>
-          </w:tcPr>
-          <w:p>
-            <w:r>
-              <w:rPr>
-                <w:rFonts w:ascii="微软雅黑" w:hAnsi="微软雅黑"/>
-                <w:sz w:val="19"/>
-              </w:rPr>
-              <w:t>curl 未付款调 /api/weather</w:t>
-            </w:r>
-          </w:p>
-        </w:tc>
-        <w:tc>
-          <w:tcPr>
-            <w:tcW w:type="dxa" w:w="2340"/>
-            <w:vAlign w:val="center"/>
-            <w:tcMar>
-              <w:top w:w="120" w:type="dxa"/>
-              <w:bottom w:w="120" w:type="dxa"/>
-              <w:left w:w="180" w:type="dxa"/>
-              <w:right w:w="180" w:type="dxa"/>
-            </w:tcMar>
-            <w:shd w:fill="F2F5F9"/>
-          </w:tcPr>
-          <w:p>
-            <w:r>
-              <w:rPr>
-                <w:rFonts w:ascii="微软雅黑" w:hAnsi="微软雅黑"/>
-                <w:b/>
-                <w:color w:val="008000"/>
-                <w:sz w:val="19"/>
-              </w:rPr>
-              <w:t>通过 (PASS)</w:t>
-            </w:r>
-          </w:p>
-        </w:tc>
-        <w:tc>
-          <w:tcPr>
-            <w:tcW w:type="dxa" w:w="2340"/>
-            <w:vAlign w:val="center"/>
-            <w:tcMar>
-              <w:top w:w="120" w:type="dxa"/>
-              <w:bottom w:w="120" w:type="dxa"/>
-              <w:left w:w="180" w:type="dxa"/>
-              <w:right w:w="180" w:type="dxa"/>
-            </w:tcMar>
-            <w:shd w:fill="F2F5F9"/>
-          </w:tcPr>
-          <w:p>
-            <w:r>
-              <w:rPr>
-                <w:rFonts w:ascii="微软雅黑" w:hAnsi="微软雅黑"/>
-                <w:sz w:val="19"/>
-              </w:rPr>
-              <w:t>返回 HTTP 402 + 结构化 Base Sepolia 账单</w:t>
-            </w:r>
-          </w:p>
-        </w:tc>
-      </w:tr>
-      <w:tr>
-        <w:trPr>
-          <w:cantSplit/>
-        </w:trPr>
-        <w:tc>
-          <w:tcPr>
-            <w:tcW w:type="dxa" w:w="2340"/>
-            <w:vAlign w:val="center"/>
-            <w:tcMar>
-              <w:top w:w="120" w:type="dxa"/>
-              <w:bottom w:w="120" w:type="dxa"/>
-              <w:left w:w="180" w:type="dxa"/>
-              <w:right w:w="180" w:type="dxa"/>
-            </w:tcMar>
-            <w:shd w:fill="FFFFFF"/>
-          </w:tcPr>
-          <w:p>
-            <w:r>
-              <w:rPr>
-                <w:rFonts w:ascii="微软雅黑" w:hAnsi="微软雅黑"/>
-                <w:sz w:val="19"/>
-              </w:rPr>
-              <w:t>标准 2</w:t>
-            </w:r>
-          </w:p>
-        </w:tc>
-        <w:tc>
-          <w:tcPr>
-            <w:tcW w:type="dxa" w:w="2340"/>
-            <w:vAlign w:val="center"/>
-            <w:tcMar>
-              <w:top w:w="120" w:type="dxa"/>
-              <w:bottom w:w="120" w:type="dxa"/>
-              <w:left w:w="180" w:type="dxa"/>
-              <w:right w:w="180" w:type="dxa"/>
-            </w:tcMar>
-            <w:shd w:fill="FFFFFF"/>
-          </w:tcPr>
-          <w:p>
-            <w:r>
-              <w:rPr>
-                <w:rFonts w:ascii="微软雅黑" w:hAnsi="微软雅黑"/>
-                <w:sz w:val="19"/>
-              </w:rPr>
-              <w:t>客户端 Agent 一次自主调用</w:t>
-            </w:r>
-          </w:p>
-        </w:tc>
-        <w:tc>
-          <w:tcPr>
-            <w:tcW w:type="dxa" w:w="2340"/>
-            <w:vAlign w:val="center"/>
-            <w:tcMar>
-              <w:top w:w="120" w:type="dxa"/>
-              <w:bottom w:w="120" w:type="dxa"/>
-              <w:left w:w="180" w:type="dxa"/>
-              <w:right w:w="180" w:type="dxa"/>
-            </w:tcMar>
-            <w:shd w:fill="FFFFFF"/>
-          </w:tcPr>
-          <w:p>
-            <w:r>
-              <w:rPr>
-                <w:rFonts w:ascii="微软雅黑" w:hAnsi="微软雅黑"/>
-                <w:b/>
-                <w:color w:val="008000"/>
-                <w:sz w:val="19"/>
-              </w:rPr>
-              <w:t>通过 (PASS)</w:t>
-            </w:r>
-          </w:p>
-        </w:tc>
-        <w:tc>
-          <w:tcPr>
-            <w:tcW w:type="dxa" w:w="2340"/>
-            <w:vAlign w:val="center"/>
-            <w:tcMar>
-              <w:top w:w="120" w:type="dxa"/>
-              <w:bottom w:w="120" w:type="dxa"/>
-              <w:left w:w="180" w:type="dxa"/>
-              <w:right w:w="180" w:type="dxa"/>
-            </w:tcMar>
-            <w:shd w:fill="FFFFFF"/>
-          </w:tcPr>
-          <w:p>
-            <w:r>
-              <w:rPr>
-                <w:rFonts w:ascii="微软雅黑" w:hAnsi="微软雅黑"/>
-                <w:sz w:val="19"/>
-              </w:rPr>
-              <w:t>成功返回 HTTP 200 + 真实实况气象数据</w:t>
-            </w:r>
-          </w:p>
-        </w:tc>
-      </w:tr>
-      <w:tr>
-        <w:trPr>
-          <w:cantSplit/>
-        </w:trPr>
-        <w:tc>
-          <w:tcPr>
-            <w:tcW w:type="dxa" w:w="2340"/>
-            <w:vAlign w:val="center"/>
-            <w:tcMar>
-              <w:top w:w="120" w:type="dxa"/>
-              <w:bottom w:w="120" w:type="dxa"/>
-              <w:left w:w="180" w:type="dxa"/>
-              <w:right w:w="180" w:type="dxa"/>
-            </w:tcMar>
-            <w:shd w:fill="F2F5F9"/>
-          </w:tcPr>
-          <w:p>
-            <w:r>
-              <w:rPr>
-                <w:rFonts w:ascii="微软雅黑" w:hAnsi="微软雅黑"/>
-                <w:sz w:val="19"/>
-              </w:rPr>
-              <w:t>标准 3</w:t>
-            </w:r>
-          </w:p>
-        </w:tc>
-        <w:tc>
-          <w:tcPr>
-            <w:tcW w:type="dxa" w:w="2340"/>
-            <w:vAlign w:val="center"/>
-            <w:tcMar>
-              <w:top w:w="120" w:type="dxa"/>
-              <w:bottom w:w="120" w:type="dxa"/>
-              <w:left w:w="180" w:type="dxa"/>
-              <w:right w:w="180" w:type="dxa"/>
-            </w:tcMar>
-            <w:shd w:fill="F2F5F9"/>
-          </w:tcPr>
-          <w:p>
-            <w:r>
-              <w:rPr>
-                <w:rFonts w:ascii="微软雅黑" w:hAnsi="微软雅黑"/>
-                <w:sz w:val="19"/>
-              </w:rPr>
-              <w:t>链上结算交易查验</w:t>
-            </w:r>
-          </w:p>
-        </w:tc>
-        <w:tc>
-          <w:tcPr>
-            <w:tcW w:type="dxa" w:w="2340"/>
-            <w:vAlign w:val="center"/>
-            <w:tcMar>
-              <w:top w:w="120" w:type="dxa"/>
-              <w:bottom w:w="120" w:type="dxa"/>
-              <w:left w:w="180" w:type="dxa"/>
-              <w:right w:w="180" w:type="dxa"/>
-            </w:tcMar>
-            <w:shd w:fill="F2F5F9"/>
-          </w:tcPr>
-          <w:p>
-            <w:r>
-              <w:rPr>
-                <w:rFonts w:ascii="微软雅黑" w:hAnsi="微软雅黑"/>
-                <w:b/>
-                <w:color w:val="008000"/>
-                <w:sz w:val="19"/>
-              </w:rPr>
-              <w:t>通过 (PASS)</w:t>
-            </w:r>
-          </w:p>
-        </w:tc>
-        <w:tc>
-          <w:tcPr>
-            <w:tcW w:type="dxa" w:w="2340"/>
-            <w:vAlign w:val="center"/>
-            <w:tcMar>
-              <w:top w:w="120" w:type="dxa"/>
-              <w:bottom w:w="120" w:type="dxa"/>
-              <w:left w:w="180" w:type="dxa"/>
-              <w:right w:w="180" w:type="dxa"/>
-            </w:tcMar>
-            <w:shd w:fill="F2F5F9"/>
-          </w:tcPr>
-          <w:p>
-            <w:r>
-              <w:rPr>
-                <w:rFonts w:ascii="微软雅黑" w:hAnsi="微软雅黑"/>
-                <w:sz w:val="19"/>
-              </w:rPr>
-              <w:t>付款方 -&gt; 收款方精确划转 1000 atomic units ($0.001 USDC)</w:t>
-            </w:r>
-          </w:p>
-        </w:tc>
-      </w:tr>
-      <w:tr>
-        <w:trPr>
-          <w:cantSplit/>
-        </w:trPr>
-        <w:tc>
-          <w:tcPr>
-            <w:tcW w:type="dxa" w:w="2340"/>
-            <w:vAlign w:val="center"/>
-            <w:tcMar>
-              <w:top w:w="120" w:type="dxa"/>
-              <w:bottom w:w="120" w:type="dxa"/>
-              <w:left w:w="180" w:type="dxa"/>
-              <w:right w:w="180" w:type="dxa"/>
-            </w:tcMar>
-            <w:shd w:fill="FFFFFF"/>
-          </w:tcPr>
-          <w:p>
-            <w:r>
-              <w:rPr>
-                <w:rFonts w:ascii="微软雅黑" w:hAnsi="微软雅黑"/>
-                <w:sz w:val="19"/>
-              </w:rPr>
-              <w:t>标准 4</w:t>
-            </w:r>
-          </w:p>
-        </w:tc>
-        <w:tc>
-          <w:tcPr>
-            <w:tcW w:type="dxa" w:w="2340"/>
-            <w:vAlign w:val="center"/>
-            <w:tcMar>
-              <w:top w:w="120" w:type="dxa"/>
-              <w:bottom w:w="120" w:type="dxa"/>
-              <w:left w:w="180" w:type="dxa"/>
-              <w:right w:w="180" w:type="dxa"/>
-            </w:tcMar>
-            <w:shd w:fill="FFFFFF"/>
-          </w:tcPr>
-          <w:p>
-            <w:r>
-              <w:rPr>
-                <w:rFonts w:ascii="微软雅黑" w:hAnsi="微软雅黑"/>
-                <w:sz w:val="19"/>
-              </w:rPr>
-              <w:t>运行链上只读对账脚本</w:t>
-            </w:r>
-          </w:p>
-        </w:tc>
-        <w:tc>
-          <w:tcPr>
-            <w:tcW w:type="dxa" w:w="2340"/>
-            <w:vAlign w:val="center"/>
-            <w:tcMar>
-              <w:top w:w="120" w:type="dxa"/>
-              <w:bottom w:w="120" w:type="dxa"/>
-              <w:left w:w="180" w:type="dxa"/>
-              <w:right w:w="180" w:type="dxa"/>
-            </w:tcMar>
-            <w:shd w:fill="FFFFFF"/>
-          </w:tcPr>
-          <w:p>
-            <w:r>
-              <w:rPr>
-                <w:rFonts w:ascii="微软雅黑" w:hAnsi="微软雅黑"/>
-                <w:b/>
-                <w:color w:val="008000"/>
-                <w:sz w:val="19"/>
-              </w:rPr>
-              <w:t>通过 (PASS)</w:t>
-            </w:r>
-          </w:p>
-        </w:tc>
-        <w:tc>
-          <w:tcPr>
-            <w:tcW w:type="dxa" w:w="2340"/>
-            <w:vAlign w:val="center"/>
-            <w:tcMar>
-              <w:top w:w="120" w:type="dxa"/>
-              <w:bottom w:w="120" w:type="dxa"/>
-              <w:left w:w="180" w:type="dxa"/>
-              <w:right w:w="180" w:type="dxa"/>
-            </w:tcMar>
-            <w:shd w:fill="FFFFFF"/>
-          </w:tcPr>
-          <w:p>
-            <w:r>
-              <w:rPr>
-                <w:rFonts w:ascii="微软雅黑" w:hAnsi="微软雅黑"/>
-                <w:b/>
-                <w:color w:val="008000"/>
-                <w:sz w:val="19"/>
-              </w:rPr>
-              <w:t>非标准 Transfer Topic 形状匹配通过，余额校验一致</w:t>
-            </w:r>
-          </w:p>
-        </w:tc>
-      </w:tr>
-      <w:tr>
-        <w:trPr>
-          <w:cantSplit/>
-        </w:trPr>
-        <w:tc>
-          <w:tcPr>
-            <w:tcW w:type="dxa" w:w="2340"/>
-            <w:vAlign w:val="center"/>
-            <w:tcMar>
-              <w:top w:w="120" w:type="dxa"/>
-              <w:bottom w:w="120" w:type="dxa"/>
-              <w:left w:w="180" w:type="dxa"/>
-              <w:right w:w="180" w:type="dxa"/>
-            </w:tcMar>
-            <w:shd w:fill="F2F5F9"/>
-          </w:tcPr>
-          <w:p>
-            <w:r>
-              <w:rPr>
-                <w:rFonts w:ascii="微软雅黑" w:hAnsi="微软雅黑"/>
-                <w:sz w:val="19"/>
-              </w:rPr>
-              <w:t>标准 5</w:t>
-            </w:r>
-          </w:p>
-        </w:tc>
-        <w:tc>
-          <w:tcPr>
-            <w:tcW w:type="dxa" w:w="2340"/>
-            <w:vAlign w:val="center"/>
-            <w:tcMar>
-              <w:top w:w="120" w:type="dxa"/>
-              <w:bottom w:w="120" w:type="dxa"/>
-              <w:left w:w="180" w:type="dxa"/>
-              <w:right w:w="180" w:type="dxa"/>
-            </w:tcMar>
-            <w:shd w:fill="F2F5F9"/>
-          </w:tcPr>
-          <w:p>
-            <w:r>
-              <w:rPr>
-                <w:rFonts w:ascii="微软雅黑" w:hAnsi="微软雅黑"/>
-                <w:sz w:val="19"/>
-              </w:rPr>
-              <w:t>Vercel 生产公网端到端复测</w:t>
-            </w:r>
-          </w:p>
-        </w:tc>
-        <w:tc>
-          <w:tcPr>
-            <w:tcW w:type="dxa" w:w="2340"/>
-            <w:vAlign w:val="center"/>
-            <w:tcMar>
-              <w:top w:w="120" w:type="dxa"/>
-              <w:bottom w:w="120" w:type="dxa"/>
-              <w:left w:w="180" w:type="dxa"/>
-              <w:right w:w="180" w:type="dxa"/>
-            </w:tcMar>
-            <w:shd w:fill="F2F5F9"/>
-          </w:tcPr>
-          <w:p>
-            <w:r>
-              <w:rPr>
-                <w:rFonts w:ascii="微软雅黑" w:hAnsi="微软雅黑"/>
-                <w:b/>
-                <w:color w:val="008000"/>
-                <w:sz w:val="19"/>
-              </w:rPr>
-              <w:t>通过 (PASS)</w:t>
-            </w:r>
-          </w:p>
-        </w:tc>
-        <w:tc>
-          <w:tcPr>
-            <w:tcW w:type="dxa" w:w="2340"/>
-            <w:vAlign w:val="center"/>
-            <w:tcMar>
-              <w:top w:w="120" w:type="dxa"/>
-              <w:bottom w:w="120" w:type="dxa"/>
-              <w:left w:w="180" w:type="dxa"/>
-              <w:right w:w="180" w:type="dxa"/>
-            </w:tcMar>
-            <w:shd w:fill="F2F5F9"/>
-          </w:tcPr>
-          <w:p>
-            <w:r>
-              <w:rPr>
-                <w:rFonts w:ascii="微软雅黑" w:hAnsi="微软雅黑"/>
-                <w:b/>
-                <w:color w:val="008000"/>
-                <w:sz w:val="19"/>
-              </w:rPr>
-              <w:t>生产域名复测 1~4 全部通过，无鉴权壁垒</w:t>
-            </w:r>
-          </w:p>
-        </w:tc>
-      </w:tr>
-    </w:tbl>
-    <w:p/>
-    <w:p>
-      <w:r>
-        <w:rPr>
-          <w:b/>
-          <w:color w:val="1F497D"/>
-        </w:rPr>
-        <w:t>【已上链的真实交易结算凭证】</w:t>
-      </w:r>
-    </w:p>
-    <w:tbl>
-      <w:tblPr>
-        <w:tblW w:type="auto" w:w="0"/>
-        <w:jc w:val="center"/>
-        <w:tblLook w:firstColumn="1" w:firstRow="1" w:lastColumn="0" w:lastRow="0" w:noHBand="0" w:noVBand="1" w:val="04A0"/>
-      </w:tblPr>
-      <w:tblGrid>
-        <w:gridCol w:w="9360"/>
-      </w:tblGrid>
-      <w:tr>
-        <w:tc>
-          <w:tcPr>
-            <w:tcW w:type="dxa" w:w="9360"/>
-            <w:shd w:fill="F8F9FA"/>
-            <w:tcMar>
-              <w:top w:w="120" w:type="dxa"/>
-              <w:bottom w:w="120" w:type="dxa"/>
-              <w:left w:w="200" w:type="dxa"/>
-              <w:right w:w="200" w:type="dxa"/>
-            </w:tcMar>
-          </w:tcPr>
-          <w:p>
-            <w:pPr>
-              <w:spacing w:before="40" w:after="40" w:line="276" w:lineRule="auto"/>
-            </w:pPr>
-            <w:r>
-              <w:rPr>
-                <w:rFonts w:ascii="Consolas" w:hAnsi="Consolas"/>
-                <w:color w:val="282C34"/>
-                <w:sz w:val="19"/>
-              </w:rPr>
-              <w:t>1. 本地测试阶段结算交易哈希 (Tx Hash):</w:t>
-              <w:br/>
-              <w:t xml:space="preserve">   0x1899a7b38ebf4af00d0e6a53e89d953c53d0fb5bdea9204c27a439a3ba4f657e</w:t>
-              <w:br/>
-              <w:t xml:space="preserve">   BaseScan 浏览器直达: https://sepolia.basescan.org/tx/0x1899a7b38ebf4af00d0e6a53e89d953c53d0fb5bdea9204c27a439a3ba4f657e</w:t>
-              <w:br/>
-              <w:br/>
-              <w:t>2. Vercel 生产环境公网结算交易哈希 (Tx Hash):</w:t>
-              <w:br/>
-              <w:t xml:space="preserve">   0x587fd1284cbc8d49ec9ce9c31f4998001c270bd6a0492d97c1a869473cc9b352</w:t>
-              <w:br/>
-              <w:t xml:space="preserve">   BaseScan 浏览器直达: https://sepolia.basescan.org/tx/0x587fd1284cbc8d49ec9ce9c31f4998001c270bd6a0492d97c1a869473cc9b352</w:t>
-              <w:br/>
-              <w:br/>
-              <w:t>3. 双方钱包实际 USDC 余额审计变动:</w:t>
-              <w:br/>
-              <w:t xml:space="preserve">   - 付款方 (Agent Payer): 初始 19.998 USDC ──&gt; 经两次调用现为 19.996 USDC (每次精确扣减 0.001)</w:t>
-              <w:br/>
-              <w:t xml:space="preserve">   - 收款方 (Server PayTo): 初始 30.002 USDC ──&gt; 经两次调用现为 30.004 USDC (每次精确增加 0.001)</w:t>
-            </w:r>
-          </w:p>
-        </w:tc>
-      </w:tr>
-    </w:tbl>
-    <w:p/>
-    <w:p>
-      <w:r>
-        <w:rPr>
-          <w:b/>
-        </w:rPr>
-        <w:t>【Vercel 公网接口付费返回的实况天气数据 (HTTP 200)】</w:t>
-      </w:r>
-    </w:p>
-    <w:tbl>
-      <w:tblPr>
-        <w:tblW w:type="auto" w:w="0"/>
-        <w:jc w:val="center"/>
-        <w:tblLook w:firstColumn="1" w:firstRow="1" w:lastColumn="0" w:lastRow="0" w:noHBand="0" w:noVBand="1" w:val="04A0"/>
-      </w:tblPr>
-      <w:tblGrid>
-        <w:gridCol w:w="9360"/>
-      </w:tblGrid>
-      <w:tr>
-        <w:tc>
-          <w:tcPr>
-            <w:tcW w:type="dxa" w:w="9360"/>
-            <w:shd w:fill="F8F9FA"/>
-            <w:tcMar>
-              <w:top w:w="120" w:type="dxa"/>
-              <w:bottom w:w="120" w:type="dxa"/>
-              <w:left w:w="200" w:type="dxa"/>
-              <w:right w:w="200" w:type="dxa"/>
-            </w:tcMar>
-          </w:tcPr>
-          <w:p>
-            <w:pPr>
-              <w:spacing w:before="40" w:after="40" w:line="276" w:lineRule="auto"/>
-            </w:pPr>
-            <w:r>
-              <w:rPr>
-                <w:rFonts w:ascii="Consolas" w:hAnsi="Consolas"/>
-                <w:color w:val="282C34"/>
-                <w:sz w:val="19"/>
-              </w:rPr>
-              <w:t>{</w:t>
-              <w:br/>
-              <w:t xml:space="preserve">  "success": true,</w:t>
-              <w:br/>
-              <w:t xml:space="preserve">  "query": { "city": "北京" },</w:t>
-              <w:br/>
-              <w:t xml:space="preserve">  "data": {</w:t>
-              <w:br/>
-              <w:t xml:space="preserve">    "provider": "Open-Meteo",</w:t>
-              <w:br/>
-              <w:t xml:space="preserve">    "queryCity": "北京",</w:t>
-              <w:br/>
-              <w:t xml:space="preserve">    "matchedLocation": "北京 (中国)",</w:t>
-              <w:br/>
-              <w:t xml:space="preserve">    "coordinates": { "latitude": 39.9075, "longitude": 116.39723 },</w:t>
-              <w:br/>
-              <w:t xml:space="preserve">    "temperature": "9.3°C",</w:t>
-              <w:br/>
-              <w:t xml:space="preserve">    "apparentTemperature": "6.9°C",</w:t>
-              <w:br/>
-              <w:t xml:space="preserve">    "humidity": "57%",</w:t>
-              <w:br/>
-              <w:t xml:space="preserve">    "weatherCondition": "阴天 (Overcast)",</w:t>
-              <w:br/>
-              <w:t xml:space="preserve">    "windSpeed": "3.4 km/h",</w:t>
-              <w:br/>
-              <w:t xml:space="preserve">    "precipitation": "0 mm",</w:t>
-              <w:br/>
-              <w:t xml:space="preserve">    "observationTime": "2026-10-20T20:15",</w:t>
-              <w:br/>
-              <w:t xml:space="preserve">    "timestamp": "2026-10-20T12:23:56.927Z"</w:t>
-              <w:br/>
-              <w:t xml:space="preserve">  }</w:t>
-              <w:br/>
-              <w:t>}</w:t>
-            </w:r>
-          </w:p>
-        </w:tc>
-      </w:tr>
-    </w:tbl>
-    <w:p/>
-    <w:p>
-      <w:pPr>
-        <w:pStyle w:val="Heading1"/>
-        <w:spacing w:before="280" w:after="120"/>
-      </w:pPr>
-      <w:r>
-        <w:t>四、 关键技术实现细节与创新处理</w:t>
+        <w:t>四、 核心技术攻坚与底层避坑经验</w:t>
       </w:r>
     </w:p>
     <w:p>
       <w:pPr>
-        <w:spacing w:before="80" w:after="80"/>
+        <w:spacing w:before="60" w:after="60"/>
       </w:pPr>
       <w:r>
         <w:rPr>
           <w:rFonts w:ascii="微软雅黑" w:hAnsi="微软雅黑"/>
           <w:b/>
-          <w:sz w:val="20"/>
         </w:rPr>
-        <w:t>• 1. x402 SDK v2 系列适配：</w:t>
+        <w:t>• 1. x402 SDK v2 规范演进：</w:t>
       </w:r>
       <w:r>
-        <w:rPr>
-          <w:rFonts w:ascii="微软雅黑" w:hAnsi="微软雅黑"/>
-          <w:sz w:val="20"/>
-        </w:rPr>
-        <w:t>服务端全面采用 @x402/express、@x402/core、@x402/evm 最新 v2 系列。严格按照规范，向中间件传入十进制字符串 "$0.001"，防止旧版由于解析原子单位而误计为 10,000 美元的严重事故。</w:t>
+        <w:t>严禁混用旧版无 scope 包（如旧版 x402-express），必须全量迁移至 @x402/* v2 系列。</w:t>
       </w:r>
     </w:p>
     <w:p>
       <w:pPr>
-        <w:spacing w:before="80" w:after="80"/>
+        <w:spacing w:before="60" w:after="60"/>
       </w:pPr>
       <w:r>
         <w:rPr>
           <w:rFonts w:ascii="微软雅黑" w:hAnsi="微软雅黑"/>
           <w:b/>
-          <w:sz w:val="20"/>
         </w:rPr>
-        <w:t>• 2. 解决测试网非标准 ERC-20 Topic 难题：</w:t>
+        <w:t>• 2. 定价必须为十进制字符串：</w:t>
       </w:r>
       <w:r>
-        <w:rPr>
-          <w:rFonts w:ascii="微软雅黑" w:hAnsi="微软雅黑"/>
-          <w:sz w:val="20"/>
-        </w:rPr>
-        <w:t>在 Base Sepolia 上，Circle 测试 USDC 的转账事件 Topic[0] 为 0xddf252ad...523b3ef，与主网标准 ERC-20 的 0xddf252ad...288b6ed 不同。对账脚本创新性地采用了「事件形状匹配」算法（过滤排除 data 为空的授权事件，精准捕获 topics[1]=付款方、topics[2]=收款方、data=转账数量的事件），实现 100% 稳健对账。</w:t>
+        <w:t>向中间件传入 price 时必须为 "$0.001" 字符串格式。若错误传入整数 1000，中间件会将其视作 1,000 美元导致调用严重超额拦截。</w:t>
       </w:r>
     </w:p>
     <w:p>
       <w:pPr>
-        <w:spacing w:before="80" w:after="80"/>
+        <w:spacing w:before="60" w:after="60"/>
       </w:pPr>
       <w:r>
         <w:rPr>
           <w:rFonts w:ascii="微软雅黑" w:hAnsi="微软雅黑"/>
           <w:b/>
-          <w:sz w:val="20"/>
         </w:rPr>
         <w:t>• 3. Windows 平台 DNS IPv6 握手超时优化：</w:t>
       </w:r>
       <w:r>
-        <w:rPr>
-          <w:rFonts w:ascii="微软雅黑" w:hAnsi="微软雅黑"/>
-          <w:sz w:val="20"/>
-        </w:rPr>
-        <w:t>在 Node.js 环境下，Windows 系统默认优先解析 IPv6 地址，导致直连 Cloudflare/Facilitator 出现握手超时。我们在所有服务与客户端入口强制配置 dns.setDefaultResultOrder('ipv4first')，将网络请求耗时从 10 秒超时降低至 1 秒以内。</w:t>
+        <w:t>Windows 下 Node.js 默认优先解析 IPv6 地址，导致连接 Cloudflare 与 Facilitator 时频繁遭遇 10 秒握手超时。在所有入口第一行强制配置 dns.setDefaultResultOrder('ipv4first')，响应降至秒级。</w:t>
       </w:r>
     </w:p>
     <w:p>
       <w:pPr>
-        <w:spacing w:before="80" w:after="80"/>
+        <w:spacing w:before="60" w:after="60"/>
       </w:pPr>
       <w:r>
         <w:rPr>
           <w:rFonts w:ascii="微软雅黑" w:hAnsi="微软雅黑"/>
           <w:b/>
-          <w:sz w:val="20"/>
         </w:rPr>
-        <w:t>• 4. Vercel Serverless Express 路由无损还原：</w:t>
+        <w:t>• 4. 测试网非标准 Transfer Topic 形状匹配：</w:t>
       </w:r>
       <w:r>
-        <w:rPr>
-          <w:rFonts w:ascii="微软雅黑" w:hAnsi="微软雅黑"/>
-          <w:sz w:val="20"/>
-        </w:rPr>
-        <w:t>针对 Vercel 将请求 rewrite 到 /api/index.js 导致的路径覆盖问题，在 vercel.json 中通过 __path=/$1 携带原始请求路径与 Query，并在 Express 入口通过前置拦截器还原 req.url，完美兼容了本地运行与云端 Serverless 部署。</w:t>
+        <w:t>Base Sepolia 上的 Circle 测试 USDC 转账事件 Topic[0] 为 0xddf252ad...523b3ef，对账脚本采用过滤排除空授权数据的「事件形状匹配」机制，保障对账解析 100% 稳健。</w:t>
       </w:r>
     </w:p>
     <w:p>
       <w:pPr>
-        <w:spacing w:before="80" w:after="80"/>
+        <w:spacing w:before="60" w:after="60"/>
       </w:pPr>
       <w:r>
         <w:rPr>
           <w:rFonts w:ascii="微软雅黑" w:hAnsi="微软雅黑"/>
           <w:b/>
-          <w:sz w:val="20"/>
         </w:rPr>
-        <w:t>• 5. 多层级私密钱包保护规范：</w:t>
+        <w:t>• 5. Vercel Serverless 路由无损还原：</w:t>
       </w:r>
       <w:r>
-        <w:rPr>
-          <w:rFonts w:ascii="微软雅黑" w:hAnsi="微软雅黑"/>
-          <w:sz w:val="20"/>
-        </w:rPr>
-        <w:t>实现了私钥零硬编码。付款方私钥支持环境变量及 D:\ZouJiancheng\星瀚\wallet\wallet.json 多层级自动探测，自动规范化 0x 前缀；并在根目录和子目录双重配置 .gitignore，确保敏感资产绝不进代码库或泄露给外部平台。</w:t>
+        <w:t>针对 Vercel 重写导致原始路由被覆盖的问题，在 vercel.json 中配置 ?__path=/$1，并在 Express 入口处通过拦截器还原 req.url，完美兼容本地与云端。</w:t>
       </w:r>
     </w:p>
     <w:p>
       <w:pPr>
-        <w:pStyle w:val="Heading1"/>
-        <w:spacing w:before="280" w:after="120"/>
-      </w:pPr>
-      <w:r>
-        <w:t>五、 工程文件结构与复测命令</w:t>
-      </w:r>
-    </w:p>
-    <w:tbl>
-      <w:tblPr>
-        <w:tblW w:type="auto" w:w="0"/>
-        <w:jc w:val="center"/>
-        <w:tblLook w:firstColumn="1" w:firstRow="1" w:lastColumn="0" w:lastRow="0" w:noHBand="0" w:noVBand="1" w:val="04A0"/>
-      </w:tblPr>
-      <w:tblGrid>
-        <w:gridCol w:w="9360"/>
-      </w:tblGrid>
-      <w:tr>
-        <w:tc>
-          <w:tcPr>
-            <w:tcW w:type="dxa" w:w="9360"/>
-            <w:shd w:fill="F8F9FA"/>
-            <w:tcMar>
-              <w:top w:w="120" w:type="dxa"/>
-              <w:bottom w:w="120" w:type="dxa"/>
-              <w:left w:w="200" w:type="dxa"/>
-              <w:right w:w="200" w:type="dxa"/>
-            </w:tcMar>
-          </w:tcPr>
-          <w:p>
-            <w:pPr>
-              <w:spacing w:before="40" w:after="40" w:line="276" w:lineRule="auto"/>
-            </w:pPr>
-            <w:r>
-              <w:rPr>
-                <w:rFonts w:ascii="Consolas" w:hAnsi="Consolas"/>
-                <w:color w:val="282C34"/>
-                <w:sz w:val="19"/>
-              </w:rPr>
-              <w:t># 1. 探测公网 402 账单（严格安全停顿）</w:t>
-              <w:br/>
-              <w:t>$env:TARGET_URL = "https://x402-weather-service.vercel.app"; node scripts/client.js "北京"</w:t>
-              <w:br/>
-              <w:br/>
-              <w:t># 2. 授权自动支付 $0.001 USDC 获取实况天气</w:t>
-              <w:br/>
-              <w:t>$env:TARGET_URL = "https://x402-weather-service.vercel.app"; $env:CONFIRM = "yes"; node scripts/client.js "北京"</w:t>
-              <w:br/>
-              <w:br/>
-              <w:t># 3. 链上只读对账</w:t>
-              <w:br/>
-              <w:t>node scripts/reconcile.js &lt;TxHash&gt;</w:t>
-            </w:r>
-          </w:p>
-        </w:tc>
-      </w:tr>
-    </w:tbl>
-    <w:p/>
-    <w:p>
-      <w:pPr>
-        <w:spacing w:before="320"/>
+        <w:spacing w:before="60" w:after="60"/>
       </w:pPr>
       <w:r>
         <w:rPr>
           <w:rFonts w:ascii="微软雅黑" w:hAnsi="微软雅黑"/>
           <w:b/>
+        </w:rPr>
+        <w:t>• 6. Windows BAT 批处理 LF 指针漂移陷阱：</w:t>
+      </w:r>
+      <w:r>
+        <w:t>Windows cmd.exe 解释器寻址硬编码按 CRLF (2字节) 计算。若脚本保存为 Linux LF (1字节)，多行累积后指针漂移，导致误将 echo 文本腰斩并作为命令执行。解决方案：强制采用 Windows CRLF 换行并以无 BOM UTF-8 保存。</w:t>
+      </w:r>
+    </w:p>
+    <w:p>
+      <w:pPr>
+        <w:spacing w:before="60" w:after="60"/>
+      </w:pPr>
+      <w:r>
+        <w:rPr>
+          <w:rFonts w:ascii="微软雅黑" w:hAnsi="微软雅黑"/>
+          <w:b/>
+        </w:rPr>
+        <w:t>• 7. 零私钥泄漏 Git 防御机制：</w:t>
+      </w:r>
+      <w:r>
+        <w:t>通过 .gitignore 物理拦截真实 wallet.json，仅在根目录提供 wallet.example.json 模版，并在提交前进行 64 位十六进制私钥扫描，确保开源代码库绝对安全。</w:t>
+      </w:r>
+    </w:p>
+    <w:p/>
+    <w:p>
+      <w:pPr>
+        <w:pStyle w:val="Heading1"/>
+        <w:spacing w:before="320" w:after="120"/>
+      </w:pPr>
+      <w:r>
+        <w:t>五、 导师答辩高频考问与标准高分回答</w:t>
+      </w:r>
+    </w:p>
+    <w:p>
+      <w:pPr>
+        <w:spacing w:before="120" w:after="40"/>
+      </w:pPr>
+      <w:r>
+        <w:rPr>
+          <w:b/>
           <w:color w:val="1F497D"/>
           <w:sz w:val="21"/>
         </w:rPr>
-        <w:t>【结论】本项目已圆满完成全部指标，成功搭建了基于 x402 协议的付费天气微服务，不仅在本地通过自动化测试，更成功部署至 Vercel 生产环境，验证了 AI Agent 自主支付、免 Gas 结算、以及端到端对账的完整商业技术闭环。</w:t>
+        <w:t>Q1：为什么 Agent 发起支付时，付款钱包里完全不需要持有以太坊 ETH 作为 Gas 手续费？</w:t>
+      </w:r>
+    </w:p>
+    <w:p>
+      <w:pPr>
+        <w:spacing w:before="40" w:after="160" w:line="288" w:lineRule="auto"/>
+      </w:pPr>
+      <w:r>
+        <w:rPr>
+          <w:color w:val="333333"/>
+          <w:sz w:val="19"/>
+        </w:rPr>
+        <w:t>答辩要点：以太坊 EIP-3009 授权签名 + Facilitator 代付中继机制。</w:t>
+        <w:br/>
+        <w:t>标准回答：本项目采用了以太坊 EIP-3009（Transfer With Authorization）标准。Agent 在付款时并不是直接向以太坊节点发送区块链交易，而是利用本地私钥在内存中生成一份密码学授权签名（相当于一张电子支票）。随后，公共 Facilitator 清算网关拿到签名作为代理人，替我们垫付 Gas 费将交易广播到 Base Sepolia 链上。USDC 智能合约验证签名合法后直接划扣代币。因此 Agent 钱包仅需持有测试 USDC，实现了真正的「零 Gas 门槛」自主付费。</w:t>
+      </w:r>
+    </w:p>
+    <w:p>
+      <w:pPr>
+        <w:spacing w:before="120" w:after="40"/>
+      </w:pPr>
+      <w:r>
+        <w:rPr>
+          <w:b/>
+          <w:color w:val="1F497D"/>
+          <w:sz w:val="21"/>
+        </w:rPr>
+        <w:t>Q2：为什么要把天气业务单独做成 src/providers/ 抽象层，直接写在接口里不是更省事吗？</w:t>
+      </w:r>
+    </w:p>
+    <w:p>
+      <w:pPr>
+        <w:spacing w:before="40" w:after="160" w:line="288" w:lineRule="auto"/>
+      </w:pPr>
+      <w:r>
+        <w:rPr>
+          <w:color w:val="333333"/>
+          <w:sz w:val="19"/>
+        </w:rPr>
+        <w:t>答辩要点：开闭原则（OCP）与策略模式（Strategy Pattern）。</w:t>
+        <w:br/>
+        <w:t>标准回答：这是为了实现架构的高内聚与低耦合。我们把「Web3 底层支付协议」与「上层业务数据获取」彻底分离。providers 是一个可插拔的抽象层，对上屏蔽了 Open-Meteo（经纬度查询）与高德（行政代码查询）的接口差异。这种设计带来了极强的工业级扩展能力：未来如果将服务升级为付费股票分析、实时金融汇率或大模型算力接口，底层的 x402 计费、中间件路由及对账代码一行都不需要修改，只需扩展 Provider 即可。</w:t>
+      </w:r>
+    </w:p>
+    <w:p>
+      <w:pPr>
+        <w:spacing w:before="120" w:after="40"/>
+      </w:pPr>
+      <w:r>
+        <w:rPr>
+          <w:b/>
+          <w:color w:val="1F497D"/>
+          <w:sz w:val="21"/>
+        </w:rPr>
+        <w:t>Q3：本地 Express 常驻服务与 Vercel 云端 Serverless 在运行机制上有何本质区别？如何实现一套代码双端复用？</w:t>
+      </w:r>
+    </w:p>
+    <w:p>
+      <w:pPr>
+        <w:spacing w:before="40" w:after="160" w:line="288" w:lineRule="auto"/>
+      </w:pPr>
+      <w:r>
+        <w:rPr>
+          <w:color w:val="333333"/>
+          <w:sz w:val="19"/>
+        </w:rPr>
+        <w:t>答辩要点：有状态常驻进程 vs 无状态事件驱动云函数；路由重写无损还原。</w:t>
+        <w:br/>
+        <w:t>标准回答：本地运行是基于 Node.js 长时间监听 3000 端口的常驻进程；而 Vercel 云端是按需冷启动、秒级执行完毕即销毁的无状态 Serverless 云函数。为了让同一套代码无缝跑在两个环境，我们在 vercel.json 中配置了重写规则 `?__path=/$1`，并在 api/index.js 入口通过前置中间件动态将 `req.query.__path` 还原回 `req.url`，既抹平了云函数的路径覆盖缺陷，又保留了本地一键调试的高效性。</w:t>
+      </w:r>
+    </w:p>
+    <w:p>
+      <w:pPr>
+        <w:spacing w:before="120" w:after="40"/>
+      </w:pPr>
+      <w:r>
+        <w:rPr>
+          <w:b/>
+          <w:color w:val="1F497D"/>
+          <w:sz w:val="21"/>
+        </w:rPr>
+        <w:t>Q4：如果后续继续演进该系统，有哪些明确的架构扩展规划？</w:t>
+      </w:r>
+    </w:p>
+    <w:p>
+      <w:pPr>
+        <w:spacing w:before="40" w:after="160" w:line="288" w:lineRule="auto"/>
+      </w:pPr>
+      <w:r>
+        <w:rPr>
+          <w:color w:val="333333"/>
+          <w:sz w:val="19"/>
+        </w:rPr>
+        <w:t>答辩要点：动态阶梯定价、ERC-4337 账户抽象、多链与流式支付。</w:t>
+        <w:br/>
+        <w:t>标准回答：规划从三个维度深入扩展：</w:t>
+        <w:br/>
+        <w:t>1) 协议层：引入动态阶梯定价（根据查询未来天数或城市复杂度动态生成金额），并引入 ERC-4337 会话密钥（Session Keys），允许 Agent 在预设预算内免重复签名批量调用；</w:t>
+        <w:br/>
+        <w:t>2) 业务层：横向拓展金融大盘、全球物流追踪与 AI 知识库检索等高商业价值 API；</w:t>
+        <w:br/>
+        <w:t>3) 经济模型：接入 Superfluid 链上流式支付（Streaming Payments），实现按秒或按流量计费，适应超高并发 Agent 交互场景。</w:t>
       </w:r>
     </w:p>
     <w:sectPr>
       <w:pgSz w:w="12240" w:h="15840"/>
-      <w:pgMar w:top="1440" w:right="1440" w:bottom="1440" w:left="1440" w:header="720" w:footer="720" w:gutter="0"/>
+      <w:pgMar w:top="1440" w:right="1584" w:bottom="1440" w:left="1584" w:header="720" w:footer="720" w:gutter="0"/>
       <w:cols w:space="720"/>
       <w:docGrid w:linePitch="360"/>
     </w:sectPr>

</xml_diff>